<commit_message>
dokumentáció oldalszámok helyének javítása
</commit_message>
<xml_diff>
--- a/Szakdolgozat_v4.docx
+++ b/Szakdolgozat_v4.docx
@@ -26,12 +26,12 @@
           <wp:inline distB="0" distT="0" distL="0" distR="0">
             <wp:extent cx="1079500" cy="1079500"/>
             <wp:effectExtent b="0" l="0" r="0" t="0"/>
-            <wp:docPr descr="KK logo 4" id="3" name="image10.png"/>
+            <wp:docPr descr="KK logo 4" id="1" name="image1.png"/>
             <a:graphic>
               <a:graphicData uri="http://schemas.openxmlformats.org/drawingml/2006/picture">
                 <pic:pic>
                   <pic:nvPicPr>
-                    <pic:cNvPr descr="KK logo 4" id="0" name="image10.png"/>
+                    <pic:cNvPr descr="KK logo 4" id="0" name="image1.png"/>
                     <pic:cNvPicPr preferRelativeResize="0"/>
                   </pic:nvPicPr>
                   <pic:blipFill>
@@ -78,12 +78,12 @@
           <wp:inline distB="0" distT="0" distL="0" distR="0">
             <wp:extent cx="1676400" cy="717550"/>
             <wp:effectExtent b="0" l="0" r="0" t="0"/>
-            <wp:docPr descr="MSZC logo" id="5" name="image5.jpg"/>
+            <wp:docPr descr="MSZC logo" id="3" name="image2.jpg"/>
             <a:graphic>
               <a:graphicData uri="http://schemas.openxmlformats.org/drawingml/2006/picture">
                 <pic:pic>
                   <pic:nvPicPr>
-                    <pic:cNvPr descr="MSZC logo" id="0" name="image5.jpg"/>
+                    <pic:cNvPr descr="MSZC logo" id="0" name="image2.jpg"/>
                     <pic:cNvPicPr preferRelativeResize="0"/>
                   </pic:nvPicPr>
                   <pic:blipFill>
@@ -833,7 +833,7 @@
           <w:pPr>
             <w:widowControl w:val="0"/>
             <w:tabs>
-              <w:tab w:val="right" w:leader="dot" w:pos="12000"/>
+              <w:tab w:val="right" w:leader="none" w:pos="12000"/>
             </w:tabs>
             <w:spacing w:after="0" w:before="60" w:line="240" w:lineRule="auto"/>
             <w:rPr>
@@ -855,7 +855,7 @@
             <w:instrText xml:space="preserve"> TOC \h \u \z \t "Heading 1,1,Heading 2,2,Heading 3,3,Heading 4,4,Heading 5,5,Heading 6,6,"</w:instrText>
             <w:fldChar w:fldCharType="separate"/>
           </w:r>
-          <w:hyperlink w:anchor="_veh6cuofaigo">
+          <w:hyperlink w:anchor="_ysy4yj1f4kfc">
             <w:r>
               <w:rPr>
                 <w:rFonts w:ascii="Arial" w:cs="Arial" w:eastAsia="Arial" w:hAnsi="Arial"/>
@@ -886,7 +886,7 @@
           <w:pPr>
             <w:widowControl w:val="0"/>
             <w:tabs>
-              <w:tab w:val="right" w:leader="dot" w:pos="12000"/>
+              <w:tab w:val="right" w:leader="none" w:pos="12000"/>
             </w:tabs>
             <w:spacing w:after="0" w:before="60" w:line="240" w:lineRule="auto"/>
             <w:rPr>
@@ -903,7 +903,7 @@
               <w:vertAlign w:val="baseline"/>
             </w:rPr>
           </w:pPr>
-          <w:hyperlink w:anchor="_8rovbi5g7x80">
+          <w:hyperlink w:anchor="_upv15mxsdjqh">
             <w:r>
               <w:rPr>
                 <w:rFonts w:ascii="Arial" w:cs="Arial" w:eastAsia="Arial" w:hAnsi="Arial"/>
@@ -934,7 +934,7 @@
           <w:pPr>
             <w:widowControl w:val="0"/>
             <w:tabs>
-              <w:tab w:val="right" w:leader="dot" w:pos="12000"/>
+              <w:tab w:val="right" w:leader="none" w:pos="12000"/>
             </w:tabs>
             <w:spacing w:after="0" w:before="60" w:line="240" w:lineRule="auto"/>
             <w:ind w:left="360" w:firstLine="0"/>
@@ -952,7 +952,7 @@
               <w:vertAlign w:val="baseline"/>
             </w:rPr>
           </w:pPr>
-          <w:hyperlink w:anchor="_47zkuveo9m57">
+          <w:hyperlink w:anchor="_7tygxgfxv981">
             <w:r>
               <w:rPr>
                 <w:rFonts w:ascii="Arial" w:cs="Arial" w:eastAsia="Arial" w:hAnsi="Arial"/>
@@ -983,7 +983,7 @@
           <w:pPr>
             <w:widowControl w:val="0"/>
             <w:tabs>
-              <w:tab w:val="right" w:leader="dot" w:pos="12000"/>
+              <w:tab w:val="right" w:leader="none" w:pos="12000"/>
             </w:tabs>
             <w:spacing w:after="0" w:before="60" w:line="240" w:lineRule="auto"/>
             <w:ind w:left="360" w:firstLine="0"/>
@@ -1001,7 +1001,7 @@
               <w:vertAlign w:val="baseline"/>
             </w:rPr>
           </w:pPr>
-          <w:hyperlink w:anchor="_66acvypkixc">
+          <w:hyperlink w:anchor="_azmspftopcw8">
             <w:r>
               <w:rPr>
                 <w:rFonts w:ascii="Arial" w:cs="Arial" w:eastAsia="Arial" w:hAnsi="Arial"/>
@@ -1032,7 +1032,7 @@
           <w:pPr>
             <w:widowControl w:val="0"/>
             <w:tabs>
-              <w:tab w:val="right" w:leader="dot" w:pos="12000"/>
+              <w:tab w:val="right" w:leader="none" w:pos="12000"/>
             </w:tabs>
             <w:spacing w:after="0" w:before="60" w:line="240" w:lineRule="auto"/>
             <w:rPr>
@@ -1049,7 +1049,7 @@
               <w:vertAlign w:val="baseline"/>
             </w:rPr>
           </w:pPr>
-          <w:hyperlink w:anchor="_q3i6f6hgnre3">
+          <w:hyperlink w:anchor="_psksp7ibdvzj">
             <w:r>
               <w:rPr>
                 <w:rFonts w:ascii="Arial" w:cs="Arial" w:eastAsia="Arial" w:hAnsi="Arial"/>
@@ -1080,7 +1080,7 @@
           <w:pPr>
             <w:widowControl w:val="0"/>
             <w:tabs>
-              <w:tab w:val="right" w:leader="dot" w:pos="12000"/>
+              <w:tab w:val="right" w:leader="none" w:pos="12000"/>
             </w:tabs>
             <w:spacing w:after="0" w:before="60" w:line="240" w:lineRule="auto"/>
             <w:rPr>
@@ -1097,7 +1097,7 @@
               <w:vertAlign w:val="baseline"/>
             </w:rPr>
           </w:pPr>
-          <w:hyperlink w:anchor="_2najbxoy25vy">
+          <w:hyperlink w:anchor="_si5nbc8d58fr">
             <w:r>
               <w:rPr>
                 <w:rFonts w:ascii="Arial" w:cs="Arial" w:eastAsia="Arial" w:hAnsi="Arial"/>
@@ -1128,7 +1128,7 @@
           <w:pPr>
             <w:widowControl w:val="0"/>
             <w:tabs>
-              <w:tab w:val="right" w:leader="dot" w:pos="12000"/>
+              <w:tab w:val="right" w:leader="none" w:pos="12000"/>
             </w:tabs>
             <w:spacing w:after="0" w:before="60" w:line="240" w:lineRule="auto"/>
             <w:ind w:left="360" w:firstLine="0"/>
@@ -1146,7 +1146,7 @@
               <w:vertAlign w:val="baseline"/>
             </w:rPr>
           </w:pPr>
-          <w:hyperlink w:anchor="_3u9hbzreji3j">
+          <w:hyperlink w:anchor="_qs9cmpbnp9bq">
             <w:r>
               <w:rPr>
                 <w:rFonts w:ascii="Arial" w:cs="Arial" w:eastAsia="Arial" w:hAnsi="Arial"/>
@@ -1177,7 +1177,7 @@
           <w:pPr>
             <w:widowControl w:val="0"/>
             <w:tabs>
-              <w:tab w:val="right" w:leader="dot" w:pos="12000"/>
+              <w:tab w:val="right" w:leader="none" w:pos="12000"/>
             </w:tabs>
             <w:spacing w:after="0" w:before="60" w:line="240" w:lineRule="auto"/>
             <w:ind w:left="360" w:firstLine="0"/>
@@ -1195,7 +1195,7 @@
               <w:vertAlign w:val="baseline"/>
             </w:rPr>
           </w:pPr>
-          <w:hyperlink w:anchor="_de4upjgk3lo4">
+          <w:hyperlink w:anchor="_vdka38erpayl">
             <w:r>
               <w:rPr>
                 <w:rFonts w:ascii="Arial" w:cs="Arial" w:eastAsia="Arial" w:hAnsi="Arial"/>
@@ -1226,7 +1226,7 @@
           <w:pPr>
             <w:widowControl w:val="0"/>
             <w:tabs>
-              <w:tab w:val="right" w:leader="dot" w:pos="12000"/>
+              <w:tab w:val="right" w:leader="none" w:pos="12000"/>
             </w:tabs>
             <w:spacing w:after="0" w:before="60" w:line="240" w:lineRule="auto"/>
             <w:ind w:left="360" w:firstLine="0"/>
@@ -1244,7 +1244,7 @@
               <w:vertAlign w:val="baseline"/>
             </w:rPr>
           </w:pPr>
-          <w:hyperlink w:anchor="_67018sucth3q">
+          <w:hyperlink w:anchor="_3f30kupbqgdw">
             <w:r>
               <w:rPr>
                 <w:rFonts w:ascii="Arial" w:cs="Arial" w:eastAsia="Arial" w:hAnsi="Arial"/>
@@ -1275,7 +1275,7 @@
           <w:pPr>
             <w:widowControl w:val="0"/>
             <w:tabs>
-              <w:tab w:val="right" w:leader="dot" w:pos="12000"/>
+              <w:tab w:val="right" w:leader="none" w:pos="12000"/>
             </w:tabs>
             <w:spacing w:after="0" w:before="60" w:line="240" w:lineRule="auto"/>
             <w:ind w:left="360" w:firstLine="0"/>
@@ -1293,7 +1293,7 @@
               <w:vertAlign w:val="baseline"/>
             </w:rPr>
           </w:pPr>
-          <w:hyperlink w:anchor="_59wq8226b43q">
+          <w:hyperlink w:anchor="_2az76oirz22f">
             <w:r>
               <w:rPr>
                 <w:rFonts w:ascii="Arial" w:cs="Arial" w:eastAsia="Arial" w:hAnsi="Arial"/>
@@ -1324,7 +1324,7 @@
           <w:pPr>
             <w:widowControl w:val="0"/>
             <w:tabs>
-              <w:tab w:val="right" w:leader="dot" w:pos="12000"/>
+              <w:tab w:val="right" w:leader="none" w:pos="12000"/>
             </w:tabs>
             <w:spacing w:after="0" w:before="60" w:line="240" w:lineRule="auto"/>
             <w:ind w:left="360" w:firstLine="0"/>
@@ -1342,7 +1342,7 @@
               <w:vertAlign w:val="baseline"/>
             </w:rPr>
           </w:pPr>
-          <w:hyperlink w:anchor="_1dp4ltgcq9qq">
+          <w:hyperlink w:anchor="_mwf2p7un0unz">
             <w:r>
               <w:rPr>
                 <w:rFonts w:ascii="Arial" w:cs="Arial" w:eastAsia="Arial" w:hAnsi="Arial"/>
@@ -1373,7 +1373,7 @@
           <w:pPr>
             <w:widowControl w:val="0"/>
             <w:tabs>
-              <w:tab w:val="right" w:leader="dot" w:pos="12000"/>
+              <w:tab w:val="right" w:leader="none" w:pos="12000"/>
             </w:tabs>
             <w:spacing w:after="0" w:before="60" w:line="240" w:lineRule="auto"/>
             <w:ind w:left="360" w:firstLine="0"/>
@@ -1391,7 +1391,7 @@
               <w:vertAlign w:val="baseline"/>
             </w:rPr>
           </w:pPr>
-          <w:hyperlink w:anchor="_olt2wtqw6mx">
+          <w:hyperlink w:anchor="_nbx7xaypl69j">
             <w:r>
               <w:rPr>
                 <w:rFonts w:ascii="Arial" w:cs="Arial" w:eastAsia="Arial" w:hAnsi="Arial"/>
@@ -1422,7 +1422,7 @@
           <w:pPr>
             <w:widowControl w:val="0"/>
             <w:tabs>
-              <w:tab w:val="right" w:leader="dot" w:pos="12000"/>
+              <w:tab w:val="right" w:leader="none" w:pos="12000"/>
             </w:tabs>
             <w:spacing w:after="0" w:before="60" w:line="240" w:lineRule="auto"/>
             <w:rPr>
@@ -1439,7 +1439,7 @@
               <w:vertAlign w:val="baseline"/>
             </w:rPr>
           </w:pPr>
-          <w:hyperlink w:anchor="_7tru8w44vaav">
+          <w:hyperlink w:anchor="_4394e0txa8mi">
             <w:r>
               <w:rPr>
                 <w:rFonts w:ascii="Arial" w:cs="Arial" w:eastAsia="Arial" w:hAnsi="Arial"/>
@@ -1470,7 +1470,7 @@
           <w:pPr>
             <w:widowControl w:val="0"/>
             <w:tabs>
-              <w:tab w:val="right" w:leader="dot" w:pos="12000"/>
+              <w:tab w:val="right" w:leader="none" w:pos="12000"/>
             </w:tabs>
             <w:spacing w:after="0" w:before="60" w:line="240" w:lineRule="auto"/>
             <w:ind w:left="360" w:firstLine="0"/>
@@ -1488,7 +1488,7 @@
               <w:vertAlign w:val="baseline"/>
             </w:rPr>
           </w:pPr>
-          <w:hyperlink w:anchor="_lt2fguovmlge">
+          <w:hyperlink w:anchor="_38uu1rcr34zh">
             <w:r>
               <w:rPr>
                 <w:rFonts w:ascii="Arial" w:cs="Arial" w:eastAsia="Arial" w:hAnsi="Arial"/>
@@ -1519,7 +1519,7 @@
           <w:pPr>
             <w:widowControl w:val="0"/>
             <w:tabs>
-              <w:tab w:val="right" w:leader="dot" w:pos="12000"/>
+              <w:tab w:val="right" w:leader="none" w:pos="12000"/>
             </w:tabs>
             <w:spacing w:after="0" w:before="60" w:line="240" w:lineRule="auto"/>
             <w:ind w:left="360" w:firstLine="0"/>
@@ -1537,7 +1537,7 @@
               <w:vertAlign w:val="baseline"/>
             </w:rPr>
           </w:pPr>
-          <w:hyperlink w:anchor="_nyfoj96vdx68">
+          <w:hyperlink w:anchor="_220exe24j1rq">
             <w:r>
               <w:rPr>
                 <w:rFonts w:ascii="Arial" w:cs="Arial" w:eastAsia="Arial" w:hAnsi="Arial"/>
@@ -1568,7 +1568,7 @@
           <w:pPr>
             <w:widowControl w:val="0"/>
             <w:tabs>
-              <w:tab w:val="right" w:leader="dot" w:pos="12000"/>
+              <w:tab w:val="right" w:leader="none" w:pos="12000"/>
             </w:tabs>
             <w:spacing w:after="0" w:before="60" w:line="240" w:lineRule="auto"/>
             <w:ind w:left="360" w:firstLine="0"/>
@@ -1586,7 +1586,7 @@
               <w:vertAlign w:val="baseline"/>
             </w:rPr>
           </w:pPr>
-          <w:hyperlink w:anchor="_1w9lg2tu88gu">
+          <w:hyperlink w:anchor="_2gaijykw5he8">
             <w:r>
               <w:rPr>
                 <w:rFonts w:ascii="Arial" w:cs="Arial" w:eastAsia="Arial" w:hAnsi="Arial"/>
@@ -1617,7 +1617,7 @@
           <w:pPr>
             <w:widowControl w:val="0"/>
             <w:tabs>
-              <w:tab w:val="right" w:leader="dot" w:pos="12000"/>
+              <w:tab w:val="right" w:leader="none" w:pos="12000"/>
             </w:tabs>
             <w:spacing w:after="0" w:before="60" w:line="240" w:lineRule="auto"/>
             <w:ind w:left="360" w:firstLine="0"/>
@@ -1635,7 +1635,7 @@
               <w:vertAlign w:val="baseline"/>
             </w:rPr>
           </w:pPr>
-          <w:hyperlink w:anchor="_3qn4y5ipg1e5">
+          <w:hyperlink w:anchor="_30ybilqhn652">
             <w:r>
               <w:rPr>
                 <w:rFonts w:ascii="Arial" w:cs="Arial" w:eastAsia="Arial" w:hAnsi="Arial"/>
@@ -1666,7 +1666,7 @@
           <w:pPr>
             <w:widowControl w:val="0"/>
             <w:tabs>
-              <w:tab w:val="right" w:leader="dot" w:pos="12000"/>
+              <w:tab w:val="right" w:leader="none" w:pos="12000"/>
             </w:tabs>
             <w:spacing w:after="0" w:before="60" w:line="240" w:lineRule="auto"/>
             <w:ind w:left="360" w:firstLine="0"/>
@@ -1684,7 +1684,7 @@
               <w:vertAlign w:val="baseline"/>
             </w:rPr>
           </w:pPr>
-          <w:hyperlink w:anchor="_6ugafgzcf63p">
+          <w:hyperlink w:anchor="_3h0hv9s34xrg">
             <w:r>
               <w:rPr>
                 <w:rFonts w:ascii="Arial" w:cs="Arial" w:eastAsia="Arial" w:hAnsi="Arial"/>
@@ -1715,7 +1715,7 @@
           <w:pPr>
             <w:widowControl w:val="0"/>
             <w:tabs>
-              <w:tab w:val="right" w:leader="dot" w:pos="12000"/>
+              <w:tab w:val="right" w:leader="none" w:pos="12000"/>
             </w:tabs>
             <w:spacing w:after="0" w:before="60" w:line="240" w:lineRule="auto"/>
             <w:rPr>
@@ -1732,7 +1732,7 @@
               <w:vertAlign w:val="baseline"/>
             </w:rPr>
           </w:pPr>
-          <w:hyperlink w:anchor="_wmv4b170e14a">
+          <w:hyperlink w:anchor="_6oef8k5k8i7y">
             <w:r>
               <w:rPr>
                 <w:rFonts w:ascii="Arial" w:cs="Arial" w:eastAsia="Arial" w:hAnsi="Arial"/>
@@ -1763,7 +1763,7 @@
           <w:pPr>
             <w:widowControl w:val="0"/>
             <w:tabs>
-              <w:tab w:val="right" w:leader="dot" w:pos="12000"/>
+              <w:tab w:val="right" w:leader="none" w:pos="12000"/>
             </w:tabs>
             <w:spacing w:after="0" w:before="60" w:line="240" w:lineRule="auto"/>
             <w:ind w:left="360" w:firstLine="0"/>
@@ -1781,7 +1781,7 @@
               <w:vertAlign w:val="baseline"/>
             </w:rPr>
           </w:pPr>
-          <w:hyperlink w:anchor="_g3expfb8qcqe">
+          <w:hyperlink w:anchor="_vqk8yx4eat21">
             <w:r>
               <w:rPr>
                 <w:rFonts w:ascii="Arial" w:cs="Arial" w:eastAsia="Arial" w:hAnsi="Arial"/>
@@ -1812,7 +1812,7 @@
           <w:pPr>
             <w:widowControl w:val="0"/>
             <w:tabs>
-              <w:tab w:val="right" w:leader="dot" w:pos="12000"/>
+              <w:tab w:val="right" w:leader="none" w:pos="12000"/>
             </w:tabs>
             <w:spacing w:after="0" w:before="60" w:line="240" w:lineRule="auto"/>
             <w:ind w:left="720" w:firstLine="0"/>
@@ -1830,7 +1830,7 @@
               <w:vertAlign w:val="baseline"/>
             </w:rPr>
           </w:pPr>
-          <w:hyperlink w:anchor="_aoo05qu99sq3">
+          <w:hyperlink w:anchor="_4frhl2c33g8k">
             <w:r>
               <w:rPr>
                 <w:rFonts w:ascii="Arial" w:cs="Arial" w:eastAsia="Arial" w:hAnsi="Arial"/>
@@ -1861,7 +1861,7 @@
           <w:pPr>
             <w:widowControl w:val="0"/>
             <w:tabs>
-              <w:tab w:val="right" w:leader="dot" w:pos="12000"/>
+              <w:tab w:val="right" w:leader="none" w:pos="12000"/>
             </w:tabs>
             <w:spacing w:after="0" w:before="60" w:line="240" w:lineRule="auto"/>
             <w:ind w:left="360" w:firstLine="0"/>
@@ -1879,7 +1879,7 @@
               <w:vertAlign w:val="baseline"/>
             </w:rPr>
           </w:pPr>
-          <w:hyperlink w:anchor="_oe9bf6ikspm">
+          <w:hyperlink w:anchor="_o0ol6ws0xpxc">
             <w:r>
               <w:rPr>
                 <w:rFonts w:ascii="Arial" w:cs="Arial" w:eastAsia="Arial" w:hAnsi="Arial"/>
@@ -1910,7 +1910,7 @@
           <w:pPr>
             <w:widowControl w:val="0"/>
             <w:tabs>
-              <w:tab w:val="right" w:leader="dot" w:pos="12000"/>
+              <w:tab w:val="right" w:leader="none" w:pos="12000"/>
             </w:tabs>
             <w:spacing w:after="0" w:before="60" w:line="240" w:lineRule="auto"/>
             <w:ind w:left="720" w:firstLine="0"/>
@@ -1928,7 +1928,7 @@
               <w:vertAlign w:val="baseline"/>
             </w:rPr>
           </w:pPr>
-          <w:hyperlink w:anchor="_mu3wj02bg264">
+          <w:hyperlink w:anchor="_4kk67er4oks3">
             <w:r>
               <w:rPr>
                 <w:rFonts w:ascii="Arial" w:cs="Arial" w:eastAsia="Arial" w:hAnsi="Arial"/>
@@ -1959,7 +1959,7 @@
           <w:pPr>
             <w:widowControl w:val="0"/>
             <w:tabs>
-              <w:tab w:val="right" w:leader="dot" w:pos="12000"/>
+              <w:tab w:val="right" w:leader="none" w:pos="12000"/>
             </w:tabs>
             <w:spacing w:after="0" w:before="60" w:line="240" w:lineRule="auto"/>
             <w:ind w:left="720" w:firstLine="0"/>
@@ -1977,7 +1977,7 @@
               <w:vertAlign w:val="baseline"/>
             </w:rPr>
           </w:pPr>
-          <w:hyperlink w:anchor="_pjl0kt578g5w">
+          <w:hyperlink w:anchor="_liq0fpvavlan">
             <w:r>
               <w:rPr>
                 <w:rFonts w:ascii="Arial" w:cs="Arial" w:eastAsia="Arial" w:hAnsi="Arial"/>
@@ -2008,7 +2008,7 @@
           <w:pPr>
             <w:widowControl w:val="0"/>
             <w:tabs>
-              <w:tab w:val="right" w:leader="dot" w:pos="12000"/>
+              <w:tab w:val="right" w:leader="none" w:pos="12000"/>
             </w:tabs>
             <w:spacing w:after="0" w:before="60" w:line="240" w:lineRule="auto"/>
             <w:ind w:left="720" w:firstLine="0"/>
@@ -2026,7 +2026,7 @@
               <w:vertAlign w:val="baseline"/>
             </w:rPr>
           </w:pPr>
-          <w:hyperlink w:anchor="_scx47fbyskrn">
+          <w:hyperlink w:anchor="_l2dg5wjbp46g">
             <w:r>
               <w:rPr>
                 <w:rFonts w:ascii="Arial" w:cs="Arial" w:eastAsia="Arial" w:hAnsi="Arial"/>
@@ -2057,7 +2057,7 @@
           <w:pPr>
             <w:widowControl w:val="0"/>
             <w:tabs>
-              <w:tab w:val="right" w:leader="dot" w:pos="12000"/>
+              <w:tab w:val="right" w:leader="none" w:pos="12000"/>
             </w:tabs>
             <w:spacing w:after="0" w:before="60" w:line="240" w:lineRule="auto"/>
             <w:ind w:left="720" w:firstLine="0"/>
@@ -2075,7 +2075,7 @@
               <w:vertAlign w:val="baseline"/>
             </w:rPr>
           </w:pPr>
-          <w:hyperlink w:anchor="_bfaq5lie2pv3">
+          <w:hyperlink w:anchor="_h2xlkqy9s9om">
             <w:r>
               <w:rPr>
                 <w:rFonts w:ascii="Arial" w:cs="Arial" w:eastAsia="Arial" w:hAnsi="Arial"/>
@@ -2106,7 +2106,7 @@
           <w:pPr>
             <w:widowControl w:val="0"/>
             <w:tabs>
-              <w:tab w:val="right" w:leader="dot" w:pos="12000"/>
+              <w:tab w:val="right" w:leader="none" w:pos="12000"/>
             </w:tabs>
             <w:spacing w:after="0" w:before="60" w:line="240" w:lineRule="auto"/>
             <w:ind w:left="720" w:firstLine="0"/>
@@ -2124,7 +2124,7 @@
               <w:vertAlign w:val="baseline"/>
             </w:rPr>
           </w:pPr>
-          <w:hyperlink w:anchor="_ddtvoy9ydam8">
+          <w:hyperlink w:anchor="_yt7v497e96hb">
             <w:r>
               <w:rPr>
                 <w:rFonts w:ascii="Arial" w:cs="Arial" w:eastAsia="Arial" w:hAnsi="Arial"/>
@@ -2155,7 +2155,7 @@
           <w:pPr>
             <w:widowControl w:val="0"/>
             <w:tabs>
-              <w:tab w:val="right" w:leader="dot" w:pos="12000"/>
+              <w:tab w:val="right" w:leader="none" w:pos="12000"/>
             </w:tabs>
             <w:spacing w:after="0" w:before="60" w:line="240" w:lineRule="auto"/>
             <w:ind w:left="360" w:firstLine="0"/>
@@ -2173,7 +2173,7 @@
               <w:vertAlign w:val="baseline"/>
             </w:rPr>
           </w:pPr>
-          <w:hyperlink w:anchor="_b0zbzxbjqekb">
+          <w:hyperlink w:anchor="_c8192dcqjvjy">
             <w:r>
               <w:rPr>
                 <w:rFonts w:ascii="Arial" w:cs="Arial" w:eastAsia="Arial" w:hAnsi="Arial"/>
@@ -2204,7 +2204,7 @@
           <w:pPr>
             <w:widowControl w:val="0"/>
             <w:tabs>
-              <w:tab w:val="right" w:leader="dot" w:pos="12000"/>
+              <w:tab w:val="right" w:leader="none" w:pos="12000"/>
             </w:tabs>
             <w:spacing w:after="0" w:before="60" w:line="240" w:lineRule="auto"/>
             <w:ind w:left="720" w:firstLine="0"/>
@@ -2222,7 +2222,7 @@
               <w:vertAlign w:val="baseline"/>
             </w:rPr>
           </w:pPr>
-          <w:hyperlink w:anchor="_haf6i7gn0nt7">
+          <w:hyperlink w:anchor="_wk3rnnxumwk2">
             <w:r>
               <w:rPr>
                 <w:rFonts w:ascii="Arial" w:cs="Arial" w:eastAsia="Arial" w:hAnsi="Arial"/>
@@ -2253,7 +2253,7 @@
           <w:pPr>
             <w:widowControl w:val="0"/>
             <w:tabs>
-              <w:tab w:val="right" w:leader="dot" w:pos="12000"/>
+              <w:tab w:val="right" w:leader="none" w:pos="12000"/>
             </w:tabs>
             <w:spacing w:after="0" w:before="60" w:line="240" w:lineRule="auto"/>
             <w:ind w:left="720" w:firstLine="0"/>
@@ -2271,7 +2271,7 @@
               <w:vertAlign w:val="baseline"/>
             </w:rPr>
           </w:pPr>
-          <w:hyperlink w:anchor="_k0nssbg41xm0">
+          <w:hyperlink w:anchor="_tgkts5e52cwx">
             <w:r>
               <w:rPr>
                 <w:rFonts w:ascii="Arial" w:cs="Arial" w:eastAsia="Arial" w:hAnsi="Arial"/>
@@ -2302,7 +2302,7 @@
           <w:pPr>
             <w:widowControl w:val="0"/>
             <w:tabs>
-              <w:tab w:val="right" w:leader="dot" w:pos="12000"/>
+              <w:tab w:val="right" w:leader="none" w:pos="12000"/>
             </w:tabs>
             <w:spacing w:after="0" w:before="60" w:line="240" w:lineRule="auto"/>
             <w:ind w:left="720" w:firstLine="0"/>
@@ -2320,7 +2320,7 @@
               <w:vertAlign w:val="baseline"/>
             </w:rPr>
           </w:pPr>
-          <w:hyperlink w:anchor="_teol1e7e64di">
+          <w:hyperlink w:anchor="_c2ncjpd30hgq">
             <w:r>
               <w:rPr>
                 <w:rFonts w:ascii="Arial" w:cs="Arial" w:eastAsia="Arial" w:hAnsi="Arial"/>
@@ -2351,7 +2351,7 @@
           <w:pPr>
             <w:widowControl w:val="0"/>
             <w:tabs>
-              <w:tab w:val="right" w:leader="dot" w:pos="12000"/>
+              <w:tab w:val="right" w:leader="none" w:pos="12000"/>
             </w:tabs>
             <w:spacing w:after="0" w:before="60" w:line="240" w:lineRule="auto"/>
             <w:ind w:left="720" w:firstLine="0"/>
@@ -2369,7 +2369,7 @@
               <w:vertAlign w:val="baseline"/>
             </w:rPr>
           </w:pPr>
-          <w:hyperlink w:anchor="_un9ugafc43p9">
+          <w:hyperlink w:anchor="_wrh6du878ovm">
             <w:r>
               <w:rPr>
                 <w:rFonts w:ascii="Arial" w:cs="Arial" w:eastAsia="Arial" w:hAnsi="Arial"/>
@@ -2400,7 +2400,7 @@
           <w:pPr>
             <w:widowControl w:val="0"/>
             <w:tabs>
-              <w:tab w:val="right" w:leader="dot" w:pos="12000"/>
+              <w:tab w:val="right" w:leader="none" w:pos="12000"/>
             </w:tabs>
             <w:spacing w:after="0" w:before="60" w:line="240" w:lineRule="auto"/>
             <w:ind w:left="720" w:firstLine="0"/>
@@ -2418,7 +2418,7 @@
               <w:vertAlign w:val="baseline"/>
             </w:rPr>
           </w:pPr>
-          <w:hyperlink w:anchor="_d02oeyj94x2k">
+          <w:hyperlink w:anchor="_l1k5np8syv8y">
             <w:r>
               <w:rPr>
                 <w:rFonts w:ascii="Arial" w:cs="Arial" w:eastAsia="Arial" w:hAnsi="Arial"/>
@@ -2449,7 +2449,7 @@
           <w:pPr>
             <w:widowControl w:val="0"/>
             <w:tabs>
-              <w:tab w:val="right" w:leader="dot" w:pos="12000"/>
+              <w:tab w:val="right" w:leader="none" w:pos="12000"/>
             </w:tabs>
             <w:spacing w:after="0" w:before="60" w:line="240" w:lineRule="auto"/>
             <w:ind w:left="720" w:firstLine="0"/>
@@ -2467,7 +2467,7 @@
               <w:vertAlign w:val="baseline"/>
             </w:rPr>
           </w:pPr>
-          <w:hyperlink w:anchor="_yjlr8zt0qai9">
+          <w:hyperlink w:anchor="_at1go4c2ie44">
             <w:r>
               <w:rPr>
                 <w:rFonts w:ascii="Arial" w:cs="Arial" w:eastAsia="Arial" w:hAnsi="Arial"/>
@@ -2498,7 +2498,7 @@
           <w:pPr>
             <w:widowControl w:val="0"/>
             <w:tabs>
-              <w:tab w:val="right" w:leader="dot" w:pos="12000"/>
+              <w:tab w:val="right" w:leader="none" w:pos="12000"/>
             </w:tabs>
             <w:spacing w:after="0" w:before="60" w:line="240" w:lineRule="auto"/>
             <w:ind w:left="720" w:firstLine="0"/>
@@ -2516,7 +2516,7 @@
               <w:vertAlign w:val="baseline"/>
             </w:rPr>
           </w:pPr>
-          <w:hyperlink w:anchor="_cq4gzu3xou2z">
+          <w:hyperlink w:anchor="_k9c5ym7enzyu">
             <w:r>
               <w:rPr>
                 <w:rFonts w:ascii="Arial" w:cs="Arial" w:eastAsia="Arial" w:hAnsi="Arial"/>
@@ -2547,7 +2547,7 @@
           <w:pPr>
             <w:widowControl w:val="0"/>
             <w:tabs>
-              <w:tab w:val="right" w:leader="dot" w:pos="12000"/>
+              <w:tab w:val="right" w:leader="none" w:pos="12000"/>
             </w:tabs>
             <w:spacing w:after="0" w:before="60" w:line="240" w:lineRule="auto"/>
             <w:ind w:left="720" w:firstLine="0"/>
@@ -2565,7 +2565,7 @@
               <w:vertAlign w:val="baseline"/>
             </w:rPr>
           </w:pPr>
-          <w:hyperlink w:anchor="_qqzoar78w8xr">
+          <w:hyperlink w:anchor="_lentizt4lnqm">
             <w:r>
               <w:rPr>
                 <w:rFonts w:ascii="Arial" w:cs="Arial" w:eastAsia="Arial" w:hAnsi="Arial"/>
@@ -2596,7 +2596,7 @@
           <w:pPr>
             <w:widowControl w:val="0"/>
             <w:tabs>
-              <w:tab w:val="right" w:leader="dot" w:pos="12000"/>
+              <w:tab w:val="right" w:leader="none" w:pos="12000"/>
             </w:tabs>
             <w:spacing w:after="0" w:before="60" w:line="240" w:lineRule="auto"/>
             <w:ind w:left="720" w:firstLine="0"/>
@@ -2614,7 +2614,7 @@
               <w:vertAlign w:val="baseline"/>
             </w:rPr>
           </w:pPr>
-          <w:hyperlink w:anchor="_enhr6kfs4kc3">
+          <w:hyperlink w:anchor="_dk9e0833rw41">
             <w:r>
               <w:rPr>
                 <w:rFonts w:ascii="Arial" w:cs="Arial" w:eastAsia="Arial" w:hAnsi="Arial"/>
@@ -2651,21 +2651,11 @@
         <w:spacing w:after="0" w:line="360" w:lineRule="auto"/>
         <w:jc w:val="center"/>
         <w:rPr/>
-      </w:pPr>
-      <w:r>
-        <w:rPr>
-          <w:rtl w:val="0"/>
-        </w:rPr>
-      </w:r>
-    </w:p>
-    <w:p>
-      <w:pPr>
-        <w:spacing w:after="0" w:line="360" w:lineRule="auto"/>
-        <w:jc w:val="left"/>
-        <w:rPr/>
         <w:sectPr>
-          <w:footerReference r:id="rId8" w:type="default"/>
-          <w:footerReference r:id="rId9" w:type="even"/>
+          <w:headerReference r:id="rId8" w:type="first"/>
+          <w:footerReference r:id="rId9" w:type="default"/>
+          <w:footerReference r:id="rId10" w:type="first"/>
+          <w:footerReference r:id="rId11" w:type="even"/>
           <w:pgSz w:h="16838" w:w="11906" w:orient="portrait"/>
           <w:pgMar w:bottom="1417" w:top="1417" w:left="1417" w:right="1417" w:header="708" w:footer="708"/>
           <w:pgNumType w:start="1"/>
@@ -2686,7 +2676,7 @@
           <w:rFonts w:ascii="Calibri" w:cs="Calibri" w:eastAsia="Calibri" w:hAnsi="Calibri"/>
         </w:rPr>
       </w:pPr>
-      <w:bookmarkStart w:colFirst="0" w:colLast="0" w:name="_veh6cuofaigo" w:id="0"/>
+      <w:bookmarkStart w:colFirst="0" w:colLast="0" w:name="_ysy4yj1f4kfc" w:id="0"/>
       <w:bookmarkEnd w:id="0"/>
       <w:r>
         <w:rPr>
@@ -2755,7 +2745,7 @@
         <w:jc w:val="center"/>
         <w:rPr/>
       </w:pPr>
-      <w:bookmarkStart w:colFirst="0" w:colLast="0" w:name="_8rovbi5g7x80" w:id="1"/>
+      <w:bookmarkStart w:colFirst="0" w:colLast="0" w:name="_upv15mxsdjqh" w:id="1"/>
       <w:bookmarkEnd w:id="1"/>
       <w:r>
         <w:rPr>
@@ -2769,7 +2759,7 @@
         <w:pStyle w:val="Heading2"/>
         <w:rPr/>
       </w:pPr>
-      <w:bookmarkStart w:colFirst="0" w:colLast="0" w:name="_47zkuveo9m57" w:id="2"/>
+      <w:bookmarkStart w:colFirst="0" w:colLast="0" w:name="_7tygxgfxv981" w:id="2"/>
       <w:bookmarkEnd w:id="2"/>
       <w:r>
         <w:rPr>
@@ -2788,16 +2778,16 @@
           <wp:inline distB="114300" distT="114300" distL="114300" distR="114300">
             <wp:extent cx="5760410" cy="3378200"/>
             <wp:effectExtent b="0" l="0" r="0" t="0"/>
-            <wp:docPr id="2" name="image18.png"/>
+            <wp:docPr id="2" name="image13.png"/>
             <a:graphic>
               <a:graphicData uri="http://schemas.openxmlformats.org/drawingml/2006/picture">
                 <pic:pic>
                   <pic:nvPicPr>
-                    <pic:cNvPr id="0" name="image18.png"/>
+                    <pic:cNvPr id="0" name="image13.png"/>
                     <pic:cNvPicPr preferRelativeResize="0"/>
                   </pic:nvPicPr>
                   <pic:blipFill>
-                    <a:blip r:embed="rId10"/>
+                    <a:blip r:embed="rId12"/>
                     <a:srcRect b="0" l="0" r="0" t="0"/>
                     <a:stretch>
                       <a:fillRect/>
@@ -2915,7 +2905,7 @@
           <w:ilvl w:val="0"/>
           <w:numId w:val="1"/>
         </w:numPr>
-        <w:spacing w:after="0" w:afterAutospacing="0" w:before="240" w:lineRule="auto"/>
+        <w:spacing w:after="0" w:before="240" w:lineRule="auto"/>
         <w:ind w:left="720" w:hanging="360"/>
         <w:rPr>
           <w:sz w:val="24"/>
@@ -2947,7 +2937,7 @@
           <w:ilvl w:val="0"/>
           <w:numId w:val="1"/>
         </w:numPr>
-        <w:spacing w:after="0" w:afterAutospacing="0" w:before="0" w:beforeAutospacing="0" w:lineRule="auto"/>
+        <w:spacing w:after="0" w:before="0" w:lineRule="auto"/>
         <w:ind w:left="720" w:hanging="360"/>
         <w:rPr>
           <w:sz w:val="24"/>
@@ -2963,6 +2953,11 @@
         </w:rPr>
         <w:t xml:space="preserve">Egyszerű drag-and-drop kezelés</w:t>
         <w:br w:type="textWrapping"/>
+      </w:r>
+      <w:r>
+        <w:rPr>
+          <w:rtl w:val="0"/>
+        </w:rPr>
       </w:r>
     </w:p>
     <w:p>
@@ -2971,7 +2966,7 @@
           <w:ilvl w:val="0"/>
           <w:numId w:val="1"/>
         </w:numPr>
-        <w:spacing w:after="0" w:afterAutospacing="0" w:before="0" w:beforeAutospacing="0" w:lineRule="auto"/>
+        <w:spacing w:after="0" w:before="0" w:lineRule="auto"/>
         <w:ind w:left="720" w:hanging="360"/>
         <w:rPr>
           <w:sz w:val="24"/>
@@ -3003,7 +2998,7 @@
           <w:ilvl w:val="0"/>
           <w:numId w:val="1"/>
         </w:numPr>
-        <w:spacing w:after="0" w:afterAutospacing="0" w:before="0" w:beforeAutospacing="0" w:lineRule="auto"/>
+        <w:spacing w:after="0" w:before="0" w:lineRule="auto"/>
         <w:ind w:left="720" w:hanging="360"/>
         <w:rPr>
           <w:sz w:val="24"/>
@@ -3035,7 +3030,7 @@
           <w:ilvl w:val="0"/>
           <w:numId w:val="1"/>
         </w:numPr>
-        <w:spacing w:after="240" w:before="0" w:beforeAutospacing="0" w:lineRule="auto"/>
+        <w:spacing w:after="240" w:before="0" w:lineRule="auto"/>
         <w:ind w:left="720" w:hanging="360"/>
         <w:rPr>
           <w:sz w:val="24"/>
@@ -3051,6 +3046,11 @@
         </w:rPr>
         <w:t xml:space="preserve">Ingyenes és prémium verziók is elérhetők</w:t>
         <w:br w:type="textWrapping"/>
+      </w:r>
+      <w:r>
+        <w:rPr>
+          <w:rtl w:val="0"/>
+        </w:rPr>
       </w:r>
     </w:p>
     <w:p>
@@ -3110,19 +3110,13 @@
         <w:spacing w:after="240" w:before="240" w:lineRule="auto"/>
         <w:rPr/>
       </w:pPr>
-      <w:bookmarkStart w:colFirst="0" w:colLast="0" w:name="_66acvypkixc" w:id="3"/>
+      <w:bookmarkStart w:colFirst="0" w:colLast="0" w:name="_azmspftopcw8" w:id="3"/>
       <w:bookmarkEnd w:id="3"/>
       <w:r>
         <w:rPr>
           <w:rtl w:val="0"/>
         </w:rPr>
-        <w:t xml:space="preserve">2. </w:t>
-      </w:r>
-      <w:r>
-        <w:rPr>
-          <w:rtl w:val="0"/>
-        </w:rPr>
-        <w:t xml:space="preserve">GitHub</w:t>
+        <w:t xml:space="preserve">2. GitHub</w:t>
       </w:r>
     </w:p>
     <w:p>
@@ -3135,16 +3129,16 @@
           <wp:inline distB="114300" distT="114300" distL="114300" distR="114300">
             <wp:extent cx="5760410" cy="2247900"/>
             <wp:effectExtent b="0" l="0" r="0" t="0"/>
-            <wp:docPr id="16" name="image17.png"/>
+            <wp:docPr id="5" name="image6.png"/>
             <a:graphic>
               <a:graphicData uri="http://schemas.openxmlformats.org/drawingml/2006/picture">
                 <pic:pic>
                   <pic:nvPicPr>
-                    <pic:cNvPr id="0" name="image17.png"/>
+                    <pic:cNvPr id="0" name="image6.png"/>
                     <pic:cNvPicPr preferRelativeResize="0"/>
                   </pic:nvPicPr>
                   <pic:blipFill>
-                    <a:blip r:embed="rId11"/>
+                    <a:blip r:embed="rId13"/>
                     <a:srcRect b="0" l="0" r="0" t="0"/>
                     <a:stretch>
                       <a:fillRect/>
@@ -3260,9 +3254,9 @@
       <w:pPr>
         <w:numPr>
           <w:ilvl w:val="0"/>
-          <w:numId w:val="2"/>
+          <w:numId w:val="8"/>
         </w:numPr>
-        <w:spacing w:after="0" w:afterAutospacing="0" w:before="240" w:lineRule="auto"/>
+        <w:spacing w:after="0" w:before="240" w:lineRule="auto"/>
         <w:ind w:left="720" w:hanging="360"/>
         <w:rPr>
           <w:sz w:val="24"/>
@@ -3279,14 +3273,19 @@
         <w:t xml:space="preserve">Git verziókezelő rendszerre épül</w:t>
         <w:br w:type="textWrapping"/>
       </w:r>
+      <w:r>
+        <w:rPr>
+          <w:rtl w:val="0"/>
+        </w:rPr>
+      </w:r>
     </w:p>
     <w:p>
       <w:pPr>
         <w:numPr>
           <w:ilvl w:val="0"/>
-          <w:numId w:val="2"/>
+          <w:numId w:val="8"/>
         </w:numPr>
-        <w:spacing w:after="0" w:afterAutospacing="0" w:before="0" w:beforeAutospacing="0" w:lineRule="auto"/>
+        <w:spacing w:after="0" w:before="0" w:lineRule="auto"/>
         <w:ind w:left="720" w:hanging="360"/>
         <w:rPr>
           <w:sz w:val="24"/>
@@ -3303,14 +3302,19 @@
         <w:t xml:space="preserve">Nyilvános és privát adattárakat (repository-kat) kínál</w:t>
         <w:br w:type="textWrapping"/>
       </w:r>
+      <w:r>
+        <w:rPr>
+          <w:rtl w:val="0"/>
+        </w:rPr>
+      </w:r>
     </w:p>
     <w:p>
       <w:pPr>
         <w:numPr>
           <w:ilvl w:val="0"/>
-          <w:numId w:val="2"/>
+          <w:numId w:val="8"/>
         </w:numPr>
-        <w:spacing w:after="0" w:afterAutospacing="0" w:before="0" w:beforeAutospacing="0" w:lineRule="auto"/>
+        <w:spacing w:after="0" w:before="0" w:lineRule="auto"/>
         <w:ind w:left="720" w:hanging="360"/>
         <w:rPr>
           <w:sz w:val="24"/>
@@ -3340,9 +3344,9 @@
       <w:pPr>
         <w:numPr>
           <w:ilvl w:val="0"/>
-          <w:numId w:val="2"/>
+          <w:numId w:val="8"/>
         </w:numPr>
-        <w:spacing w:after="0" w:afterAutospacing="0" w:before="0" w:beforeAutospacing="0" w:lineRule="auto"/>
+        <w:spacing w:after="0" w:before="0" w:lineRule="auto"/>
         <w:ind w:left="720" w:hanging="360"/>
         <w:rPr>
           <w:sz w:val="24"/>
@@ -3372,9 +3376,9 @@
       <w:pPr>
         <w:numPr>
           <w:ilvl w:val="0"/>
-          <w:numId w:val="2"/>
+          <w:numId w:val="8"/>
         </w:numPr>
-        <w:spacing w:after="240" w:before="0" w:beforeAutospacing="0" w:lineRule="auto"/>
+        <w:spacing w:after="240" w:before="0" w:lineRule="auto"/>
         <w:ind w:left="720" w:hanging="360"/>
         <w:rPr>
           <w:sz w:val="24"/>
@@ -3390,6 +3394,11 @@
         </w:rPr>
         <w:t xml:space="preserve">Open-source projektekhez és privát fejlesztésekhez egyaránt használható</w:t>
         <w:br w:type="textWrapping"/>
+      </w:r>
+      <w:r>
+        <w:rPr>
+          <w:rtl w:val="0"/>
+        </w:rPr>
       </w:r>
     </w:p>
     <w:p>
@@ -3474,7 +3483,7 @@
         <w:jc w:val="center"/>
         <w:rPr/>
       </w:pPr>
-      <w:bookmarkStart w:colFirst="0" w:colLast="0" w:name="_q3i6f6hgnre3" w:id="4"/>
+      <w:bookmarkStart w:colFirst="0" w:colLast="0" w:name="_psksp7ibdvzj" w:id="4"/>
       <w:bookmarkEnd w:id="4"/>
       <w:r>
         <w:rPr>
@@ -21188,7 +21197,7 @@
         <w:jc w:val="center"/>
         <w:rPr/>
       </w:pPr>
-      <w:bookmarkStart w:colFirst="0" w:colLast="0" w:name="_2najbxoy25vy" w:id="5"/>
+      <w:bookmarkStart w:colFirst="0" w:colLast="0" w:name="_si5nbc8d58fr" w:id="5"/>
       <w:bookmarkEnd w:id="5"/>
       <w:r>
         <w:rPr>
@@ -21203,7 +21212,7 @@
         <w:spacing w:after="200" w:line="276" w:lineRule="auto"/>
         <w:rPr/>
       </w:pPr>
-      <w:bookmarkStart w:colFirst="0" w:colLast="0" w:name="_3u9hbzreji3j" w:id="6"/>
+      <w:bookmarkStart w:colFirst="0" w:colLast="0" w:name="_qs9cmpbnp9bq" w:id="6"/>
       <w:bookmarkEnd w:id="6"/>
       <w:r>
         <w:rPr>
@@ -21235,7 +21244,7 @@
         <w:spacing w:after="200" w:line="276" w:lineRule="auto"/>
         <w:rPr/>
       </w:pPr>
-      <w:bookmarkStart w:colFirst="0" w:colLast="0" w:name="_de4upjgk3lo4" w:id="7"/>
+      <w:bookmarkStart w:colFirst="0" w:colLast="0" w:name="_vdka38erpayl" w:id="7"/>
       <w:bookmarkEnd w:id="7"/>
       <w:r>
         <w:rPr>
@@ -21352,7 +21361,7 @@
         <w:spacing w:after="200" w:line="276" w:lineRule="auto"/>
         <w:rPr/>
       </w:pPr>
-      <w:bookmarkStart w:colFirst="0" w:colLast="0" w:name="_67018sucth3q" w:id="8"/>
+      <w:bookmarkStart w:colFirst="0" w:colLast="0" w:name="_3f30kupbqgdw" w:id="8"/>
       <w:bookmarkEnd w:id="8"/>
       <w:r>
         <w:rPr>
@@ -21384,7 +21393,7 @@
         <w:spacing w:after="200" w:line="276" w:lineRule="auto"/>
         <w:rPr/>
       </w:pPr>
-      <w:bookmarkStart w:colFirst="0" w:colLast="0" w:name="_59wq8226b43q" w:id="9"/>
+      <w:bookmarkStart w:colFirst="0" w:colLast="0" w:name="_2az76oirz22f" w:id="9"/>
       <w:bookmarkEnd w:id="9"/>
       <w:r>
         <w:rPr>
@@ -21416,7 +21425,7 @@
         <w:spacing w:after="200" w:line="276" w:lineRule="auto"/>
         <w:rPr/>
       </w:pPr>
-      <w:bookmarkStart w:colFirst="0" w:colLast="0" w:name="_1dp4ltgcq9qq" w:id="10"/>
+      <w:bookmarkStart w:colFirst="0" w:colLast="0" w:name="_mwf2p7un0unz" w:id="10"/>
       <w:bookmarkEnd w:id="10"/>
       <w:r>
         <w:rPr>
@@ -21448,7 +21457,7 @@
         <w:spacing w:after="200" w:line="276" w:lineRule="auto"/>
         <w:rPr/>
       </w:pPr>
-      <w:bookmarkStart w:colFirst="0" w:colLast="0" w:name="_olt2wtqw6mx" w:id="11"/>
+      <w:bookmarkStart w:colFirst="0" w:colLast="0" w:name="_nbx7xaypl69j" w:id="11"/>
       <w:bookmarkEnd w:id="11"/>
       <w:r>
         <w:rPr>
@@ -21481,7 +21490,7 @@
         <w:jc w:val="center"/>
         <w:rPr/>
       </w:pPr>
-      <w:bookmarkStart w:colFirst="0" w:colLast="0" w:name="_7tru8w44vaav" w:id="12"/>
+      <w:bookmarkStart w:colFirst="0" w:colLast="0" w:name="_4394e0txa8mi" w:id="12"/>
       <w:bookmarkEnd w:id="12"/>
       <w:r>
         <w:rPr>
@@ -21496,7 +21505,7 @@
         <w:spacing w:after="200" w:line="276" w:lineRule="auto"/>
         <w:rPr/>
       </w:pPr>
-      <w:bookmarkStart w:colFirst="0" w:colLast="0" w:name="_lt2fguovmlge" w:id="13"/>
+      <w:bookmarkStart w:colFirst="0" w:colLast="0" w:name="_38uu1rcr34zh" w:id="13"/>
       <w:bookmarkEnd w:id="13"/>
       <w:r>
         <w:rPr>
@@ -21590,16 +21599,16 @@
           <wp:inline distB="114300" distT="114300" distL="114300" distR="114300">
             <wp:extent cx="5760410" cy="3238500"/>
             <wp:effectExtent b="0" l="0" r="0" t="0"/>
-            <wp:docPr id="4" name="image3.png"/>
+            <wp:docPr id="4" name="image7.png"/>
             <a:graphic>
               <a:graphicData uri="http://schemas.openxmlformats.org/drawingml/2006/picture">
                 <pic:pic>
                   <pic:nvPicPr>
-                    <pic:cNvPr id="0" name="image3.png"/>
+                    <pic:cNvPr id="0" name="image7.png"/>
                     <pic:cNvPicPr preferRelativeResize="0"/>
                   </pic:nvPicPr>
                   <pic:blipFill>
-                    <a:blip r:embed="rId12"/>
+                    <a:blip r:embed="rId14"/>
                     <a:srcRect b="0" l="0" r="0" t="0"/>
                     <a:stretch>
                       <a:fillRect/>
@@ -21646,7 +21655,7 @@
         <w:spacing w:after="200" w:line="276" w:lineRule="auto"/>
         <w:rPr/>
       </w:pPr>
-      <w:bookmarkStart w:colFirst="0" w:colLast="0" w:name="_nyfoj96vdx68" w:id="14"/>
+      <w:bookmarkStart w:colFirst="0" w:colLast="0" w:name="_220exe24j1rq" w:id="14"/>
       <w:bookmarkEnd w:id="14"/>
       <w:r>
         <w:rPr>
@@ -21690,16 +21699,16 @@
           <wp:inline distB="114300" distT="114300" distL="114300" distR="114300">
             <wp:extent cx="4000500" cy="3448050"/>
             <wp:effectExtent b="0" l="0" r="0" t="0"/>
-            <wp:docPr id="7" name="image12.png"/>
+            <wp:docPr id="7" name="image4.png"/>
             <a:graphic>
               <a:graphicData uri="http://schemas.openxmlformats.org/drawingml/2006/picture">
                 <pic:pic>
                   <pic:nvPicPr>
-                    <pic:cNvPr id="0" name="image12.png"/>
+                    <pic:cNvPr id="0" name="image4.png"/>
                     <pic:cNvPicPr preferRelativeResize="0"/>
                   </pic:nvPicPr>
                   <pic:blipFill>
-                    <a:blip r:embed="rId13"/>
+                    <a:blip r:embed="rId15"/>
                     <a:srcRect b="0" l="0" r="0" t="0"/>
                     <a:stretch>
                       <a:fillRect/>
@@ -21731,7 +21740,7 @@
         <w:spacing w:after="200" w:line="240" w:lineRule="auto"/>
         <w:rPr/>
       </w:pPr>
-      <w:bookmarkStart w:colFirst="0" w:colLast="0" w:name="_1w9lg2tu88gu" w:id="15"/>
+      <w:bookmarkStart w:colFirst="0" w:colLast="0" w:name="_2gaijykw5he8" w:id="15"/>
       <w:bookmarkEnd w:id="15"/>
       <w:r>
         <w:rPr>
@@ -21775,16 +21784,16 @@
           <wp:inline distB="114300" distT="114300" distL="114300" distR="114300">
             <wp:extent cx="4000500" cy="4772025"/>
             <wp:effectExtent b="0" l="0" r="0" t="0"/>
-            <wp:docPr id="6" name="image7.png"/>
+            <wp:docPr id="6" name="image11.png"/>
             <a:graphic>
               <a:graphicData uri="http://schemas.openxmlformats.org/drawingml/2006/picture">
                 <pic:pic>
                   <pic:nvPicPr>
-                    <pic:cNvPr id="0" name="image7.png"/>
+                    <pic:cNvPr id="0" name="image11.png"/>
                     <pic:cNvPicPr preferRelativeResize="0"/>
                   </pic:nvPicPr>
                   <pic:blipFill>
-                    <a:blip r:embed="rId14"/>
+                    <a:blip r:embed="rId16"/>
                     <a:srcRect b="0" l="0" r="0" t="0"/>
                     <a:stretch>
                       <a:fillRect/>
@@ -21816,7 +21825,7 @@
         <w:spacing w:after="200" w:line="240" w:lineRule="auto"/>
         <w:rPr/>
       </w:pPr>
-      <w:bookmarkStart w:colFirst="0" w:colLast="0" w:name="_3qn4y5ipg1e5" w:id="16"/>
+      <w:bookmarkStart w:colFirst="0" w:colLast="0" w:name="_30ybilqhn652" w:id="16"/>
       <w:bookmarkEnd w:id="16"/>
       <w:r>
         <w:rPr>
@@ -21876,16 +21885,16 @@
           <wp:inline distB="114300" distT="114300" distL="114300" distR="114300">
             <wp:extent cx="5760410" cy="3251200"/>
             <wp:effectExtent b="0" l="0" r="0" t="0"/>
-            <wp:docPr id="9" name="image13.png"/>
+            <wp:docPr id="9" name="image5.png"/>
             <a:graphic>
               <a:graphicData uri="http://schemas.openxmlformats.org/drawingml/2006/picture">
                 <pic:pic>
                   <pic:nvPicPr>
-                    <pic:cNvPr id="0" name="image13.png"/>
+                    <pic:cNvPr id="0" name="image5.png"/>
                     <pic:cNvPicPr preferRelativeResize="0"/>
                   </pic:nvPicPr>
                   <pic:blipFill>
-                    <a:blip r:embed="rId15"/>
+                    <a:blip r:embed="rId17"/>
                     <a:srcRect b="0" l="0" r="0" t="0"/>
                     <a:stretch>
                       <a:fillRect/>
@@ -21945,16 +21954,16 @@
           <wp:inline distB="114300" distT="114300" distL="114300" distR="114300">
             <wp:extent cx="3962400" cy="4781550"/>
             <wp:effectExtent b="0" l="0" r="0" t="0"/>
-            <wp:docPr id="8" name="image6.png"/>
+            <wp:docPr id="8" name="image15.png"/>
             <a:graphic>
               <a:graphicData uri="http://schemas.openxmlformats.org/drawingml/2006/picture">
                 <pic:pic>
                   <pic:nvPicPr>
-                    <pic:cNvPr id="0" name="image6.png"/>
+                    <pic:cNvPr id="0" name="image15.png"/>
                     <pic:cNvPicPr preferRelativeResize="0"/>
                   </pic:nvPicPr>
                   <pic:blipFill>
-                    <a:blip r:embed="rId16"/>
+                    <a:blip r:embed="rId18"/>
                     <a:srcRect b="0" l="0" r="0" t="0"/>
                     <a:stretch>
                       <a:fillRect/>
@@ -22014,16 +22023,16 @@
           <wp:inline distB="114300" distT="114300" distL="114300" distR="114300">
             <wp:extent cx="4572000" cy="5257800"/>
             <wp:effectExtent b="0" l="0" r="0" t="0"/>
-            <wp:docPr id="11" name="image4.png"/>
+            <wp:docPr id="12" name="image14.png"/>
             <a:graphic>
               <a:graphicData uri="http://schemas.openxmlformats.org/drawingml/2006/picture">
                 <pic:pic>
                   <pic:nvPicPr>
-                    <pic:cNvPr id="0" name="image4.png"/>
+                    <pic:cNvPr id="0" name="image14.png"/>
                     <pic:cNvPicPr preferRelativeResize="0"/>
                   </pic:nvPicPr>
                   <pic:blipFill>
-                    <a:blip r:embed="rId17"/>
+                    <a:blip r:embed="rId19"/>
                     <a:srcRect b="0" l="0" r="0" t="0"/>
                     <a:stretch>
                       <a:fillRect/>
@@ -22055,7 +22064,7 @@
         <w:spacing w:after="200" w:line="240" w:lineRule="auto"/>
         <w:rPr/>
       </w:pPr>
-      <w:bookmarkStart w:colFirst="0" w:colLast="0" w:name="_6ugafgzcf63p" w:id="17"/>
+      <w:bookmarkStart w:colFirst="0" w:colLast="0" w:name="_3h0hv9s34xrg" w:id="17"/>
       <w:bookmarkEnd w:id="17"/>
       <w:r>
         <w:rPr>
@@ -22099,16 +22108,16 @@
           <wp:inline distB="114300" distT="114300" distL="114300" distR="114300">
             <wp:extent cx="3390900" cy="1647825"/>
             <wp:effectExtent b="0" l="0" r="0" t="0"/>
-            <wp:docPr id="10" name="image11.png"/>
+            <wp:docPr id="10" name="image9.png"/>
             <a:graphic>
               <a:graphicData uri="http://schemas.openxmlformats.org/drawingml/2006/picture">
                 <pic:pic>
                   <pic:nvPicPr>
-                    <pic:cNvPr id="0" name="image11.png"/>
+                    <pic:cNvPr id="0" name="image9.png"/>
                     <pic:cNvPicPr preferRelativeResize="0"/>
                   </pic:nvPicPr>
                   <pic:blipFill>
-                    <a:blip r:embed="rId18"/>
+                    <a:blip r:embed="rId20"/>
                     <a:srcRect b="0" l="0" r="0" t="0"/>
                     <a:stretch>
                       <a:fillRect/>
@@ -22169,7 +22178,7 @@
         <w:jc w:val="center"/>
         <w:rPr/>
       </w:pPr>
-      <w:bookmarkStart w:colFirst="0" w:colLast="0" w:name="_wmv4b170e14a" w:id="18"/>
+      <w:bookmarkStart w:colFirst="0" w:colLast="0" w:name="_6oef8k5k8i7y" w:id="18"/>
       <w:bookmarkEnd w:id="18"/>
       <w:r>
         <w:rPr>
@@ -22249,7 +22258,7 @@
         <w:spacing w:after="200" w:line="240" w:lineRule="auto"/>
         <w:rPr/>
       </w:pPr>
-      <w:bookmarkStart w:colFirst="0" w:colLast="0" w:name="_g3expfb8qcqe" w:id="19"/>
+      <w:bookmarkStart w:colFirst="0" w:colLast="0" w:name="_vqk8yx4eat21" w:id="19"/>
       <w:bookmarkEnd w:id="19"/>
       <w:r>
         <w:rPr>
@@ -22284,7 +22293,7 @@
           <w:szCs w:val="24"/>
         </w:rPr>
       </w:pPr>
-      <w:bookmarkStart w:colFirst="0" w:colLast="0" w:name="_aoo05qu99sq3" w:id="20"/>
+      <w:bookmarkStart w:colFirst="0" w:colLast="0" w:name="_4frhl2c33g8k" w:id="20"/>
       <w:bookmarkEnd w:id="20"/>
       <w:r>
         <w:rPr>
@@ -22368,9 +22377,9 @@
       <w:pPr>
         <w:numPr>
           <w:ilvl w:val="0"/>
-          <w:numId w:val="14"/>
+          <w:numId w:val="6"/>
         </w:numPr>
-        <w:spacing w:after="0" w:afterAutospacing="0" w:before="240" w:lineRule="auto"/>
+        <w:spacing w:after="0" w:before="240" w:lineRule="auto"/>
         <w:ind w:left="720" w:hanging="360"/>
         <w:rPr>
           <w:sz w:val="24"/>
@@ -22400,9 +22409,9 @@
       <w:pPr>
         <w:numPr>
           <w:ilvl w:val="0"/>
-          <w:numId w:val="14"/>
+          <w:numId w:val="6"/>
         </w:numPr>
-        <w:spacing w:after="0" w:afterAutospacing="0" w:before="0" w:beforeAutospacing="0" w:lineRule="auto"/>
+        <w:spacing w:after="0" w:before="0" w:lineRule="auto"/>
         <w:ind w:left="720" w:hanging="360"/>
         <w:rPr>
           <w:sz w:val="24"/>
@@ -22432,9 +22441,9 @@
       <w:pPr>
         <w:numPr>
           <w:ilvl w:val="0"/>
-          <w:numId w:val="14"/>
+          <w:numId w:val="6"/>
         </w:numPr>
-        <w:spacing w:after="0" w:afterAutospacing="0" w:before="0" w:beforeAutospacing="0" w:lineRule="auto"/>
+        <w:spacing w:after="0" w:before="0" w:lineRule="auto"/>
         <w:ind w:left="720" w:hanging="360"/>
         <w:rPr>
           <w:sz w:val="24"/>
@@ -22464,9 +22473,9 @@
       <w:pPr>
         <w:numPr>
           <w:ilvl w:val="0"/>
-          <w:numId w:val="14"/>
+          <w:numId w:val="6"/>
         </w:numPr>
-        <w:spacing w:after="240" w:before="0" w:beforeAutospacing="0" w:lineRule="auto"/>
+        <w:spacing w:after="240" w:before="0" w:lineRule="auto"/>
         <w:ind w:left="720" w:hanging="360"/>
         <w:rPr>
           <w:sz w:val="24"/>
@@ -22515,9 +22524,9 @@
       <w:pPr>
         <w:numPr>
           <w:ilvl w:val="0"/>
-          <w:numId w:val="15"/>
+          <w:numId w:val="7"/>
         </w:numPr>
-        <w:spacing w:after="0" w:afterAutospacing="0" w:before="240" w:lineRule="auto"/>
+        <w:spacing w:after="0" w:before="240" w:lineRule="auto"/>
         <w:ind w:left="720" w:hanging="360"/>
         <w:rPr>
           <w:sz w:val="24"/>
@@ -22547,9 +22556,9 @@
       <w:pPr>
         <w:numPr>
           <w:ilvl w:val="0"/>
-          <w:numId w:val="15"/>
+          <w:numId w:val="7"/>
         </w:numPr>
-        <w:spacing w:after="0" w:afterAutospacing="0" w:before="0" w:beforeAutospacing="0" w:lineRule="auto"/>
+        <w:spacing w:after="0" w:before="0" w:lineRule="auto"/>
         <w:ind w:left="720" w:hanging="360"/>
         <w:rPr>
           <w:sz w:val="24"/>
@@ -22579,9 +22588,9 @@
       <w:pPr>
         <w:numPr>
           <w:ilvl w:val="0"/>
-          <w:numId w:val="15"/>
+          <w:numId w:val="7"/>
         </w:numPr>
-        <w:spacing w:after="240" w:before="0" w:beforeAutospacing="0" w:lineRule="auto"/>
+        <w:spacing w:after="240" w:before="0" w:lineRule="auto"/>
         <w:ind w:left="720" w:hanging="360"/>
         <w:rPr>
           <w:sz w:val="24"/>
@@ -22657,7 +22666,7 @@
         <w:spacing w:after="200" w:line="240" w:lineRule="auto"/>
         <w:rPr/>
       </w:pPr>
-      <w:bookmarkStart w:colFirst="0" w:colLast="0" w:name="_oe9bf6ikspm" w:id="21"/>
+      <w:bookmarkStart w:colFirst="0" w:colLast="0" w:name="_o0ol6ws0xpxc" w:id="21"/>
       <w:bookmarkEnd w:id="21"/>
       <w:r>
         <w:rPr>
@@ -22692,7 +22701,7 @@
           <w:szCs w:val="24"/>
         </w:rPr>
       </w:pPr>
-      <w:bookmarkStart w:colFirst="0" w:colLast="0" w:name="_mu3wj02bg264" w:id="22"/>
+      <w:bookmarkStart w:colFirst="0" w:colLast="0" w:name="_4kk67er4oks3" w:id="22"/>
       <w:bookmarkEnd w:id="22"/>
       <w:r>
         <w:rPr>
@@ -22722,16 +22731,16 @@
           <wp:inline distB="114300" distT="114300" distL="114300" distR="114300">
             <wp:extent cx="5760410" cy="3238500"/>
             <wp:effectExtent b="0" l="0" r="0" t="0"/>
-            <wp:docPr id="1" name="image9.png"/>
+            <wp:docPr id="11" name="image17.png"/>
             <a:graphic>
               <a:graphicData uri="http://schemas.openxmlformats.org/drawingml/2006/picture">
                 <pic:pic>
                   <pic:nvPicPr>
-                    <pic:cNvPr id="0" name="image9.png"/>
+                    <pic:cNvPr id="0" name="image17.png"/>
                     <pic:cNvPicPr preferRelativeResize="0"/>
                   </pic:nvPicPr>
                   <pic:blipFill>
-                    <a:blip r:embed="rId19"/>
+                    <a:blip r:embed="rId21"/>
                     <a:srcRect b="0" l="0" r="0" t="0"/>
                     <a:stretch>
                       <a:fillRect/>
@@ -22797,9 +22806,9 @@
       <w:pPr>
         <w:numPr>
           <w:ilvl w:val="0"/>
-          <w:numId w:val="12"/>
+          <w:numId w:val="4"/>
         </w:numPr>
-        <w:spacing w:after="0" w:afterAutospacing="0" w:before="240" w:line="240" w:lineRule="auto"/>
+        <w:spacing w:after="0" w:before="240" w:line="240" w:lineRule="auto"/>
         <w:ind w:left="720" w:hanging="360"/>
         <w:rPr>
           <w:sz w:val="24"/>
@@ -22820,9 +22829,9 @@
       <w:pPr>
         <w:numPr>
           <w:ilvl w:val="0"/>
-          <w:numId w:val="12"/>
+          <w:numId w:val="4"/>
         </w:numPr>
-        <w:spacing w:after="0" w:afterAutospacing="0" w:before="0" w:beforeAutospacing="0" w:line="240" w:lineRule="auto"/>
+        <w:spacing w:after="0" w:before="0" w:line="240" w:lineRule="auto"/>
         <w:ind w:left="720" w:hanging="360"/>
         <w:rPr>
           <w:sz w:val="24"/>
@@ -22843,9 +22852,9 @@
       <w:pPr>
         <w:numPr>
           <w:ilvl w:val="0"/>
-          <w:numId w:val="12"/>
+          <w:numId w:val="4"/>
         </w:numPr>
-        <w:spacing w:after="0" w:afterAutospacing="0" w:before="0" w:beforeAutospacing="0" w:line="240" w:lineRule="auto"/>
+        <w:spacing w:after="0" w:before="0" w:line="240" w:lineRule="auto"/>
         <w:ind w:left="720" w:hanging="360"/>
         <w:rPr>
           <w:sz w:val="24"/>
@@ -22866,9 +22875,9 @@
       <w:pPr>
         <w:numPr>
           <w:ilvl w:val="0"/>
-          <w:numId w:val="12"/>
+          <w:numId w:val="4"/>
         </w:numPr>
-        <w:spacing w:after="0" w:afterAutospacing="0" w:before="0" w:beforeAutospacing="0" w:line="240" w:lineRule="auto"/>
+        <w:spacing w:after="0" w:before="0" w:line="240" w:lineRule="auto"/>
         <w:ind w:left="720" w:hanging="360"/>
         <w:rPr>
           <w:sz w:val="24"/>
@@ -22889,9 +22898,9 @@
       <w:pPr>
         <w:numPr>
           <w:ilvl w:val="0"/>
-          <w:numId w:val="12"/>
+          <w:numId w:val="4"/>
         </w:numPr>
-        <w:spacing w:after="240" w:before="0" w:beforeAutospacing="0" w:line="240" w:lineRule="auto"/>
+        <w:spacing w:after="240" w:before="0" w:line="240" w:lineRule="auto"/>
         <w:ind w:left="720" w:hanging="360"/>
         <w:rPr>
           <w:sz w:val="24"/>
@@ -22970,7 +22979,7 @@
           <w:szCs w:val="24"/>
         </w:rPr>
       </w:pPr>
-      <w:bookmarkStart w:colFirst="0" w:colLast="0" w:name="_pjl0kt578g5w" w:id="23"/>
+      <w:bookmarkStart w:colFirst="0" w:colLast="0" w:name="_liq0fpvavlan" w:id="23"/>
       <w:bookmarkEnd w:id="23"/>
       <w:r>
         <w:rPr>
@@ -26715,7 +26724,7 @@
           <w:szCs w:val="24"/>
         </w:rPr>
       </w:pPr>
-      <w:bookmarkStart w:colFirst="0" w:colLast="0" w:name="_scx47fbyskrn" w:id="24"/>
+      <w:bookmarkStart w:colFirst="0" w:colLast="0" w:name="_l2dg5wjbp46g" w:id="24"/>
       <w:bookmarkEnd w:id="24"/>
       <w:r>
         <w:rPr>
@@ -26745,16 +26754,16 @@
           <wp:inline distB="114300" distT="114300" distL="114300" distR="114300">
             <wp:extent cx="5760410" cy="3454400"/>
             <wp:effectExtent b="0" l="0" r="0" t="0"/>
-            <wp:docPr id="17" name="image1.png"/>
+            <wp:docPr id="13" name="image3.png"/>
             <a:graphic>
               <a:graphicData uri="http://schemas.openxmlformats.org/drawingml/2006/picture">
                 <pic:pic>
                   <pic:nvPicPr>
-                    <pic:cNvPr id="0" name="image1.png"/>
+                    <pic:cNvPr id="0" name="image3.png"/>
                     <pic:cNvPicPr preferRelativeResize="0"/>
                   </pic:nvPicPr>
                   <pic:blipFill>
-                    <a:blip r:embed="rId20"/>
+                    <a:blip r:embed="rId22"/>
                     <a:srcRect b="0" l="0" r="0" t="0"/>
                     <a:stretch>
                       <a:fillRect/>
@@ -26888,9 +26897,9 @@
       <w:pPr>
         <w:numPr>
           <w:ilvl w:val="0"/>
-          <w:numId w:val="13"/>
+          <w:numId w:val="5"/>
         </w:numPr>
-        <w:spacing w:after="0" w:afterAutospacing="0" w:before="240" w:line="240" w:lineRule="auto"/>
+        <w:spacing w:after="0" w:before="240" w:line="240" w:lineRule="auto"/>
         <w:ind w:left="720" w:hanging="360"/>
         <w:rPr>
           <w:sz w:val="24"/>
@@ -26974,9 +26983,9 @@
       <w:pPr>
         <w:numPr>
           <w:ilvl w:val="0"/>
-          <w:numId w:val="13"/>
+          <w:numId w:val="5"/>
         </w:numPr>
-        <w:spacing w:after="0" w:afterAutospacing="0" w:before="0" w:beforeAutospacing="0" w:line="240" w:lineRule="auto"/>
+        <w:spacing w:after="0" w:before="0" w:line="240" w:lineRule="auto"/>
         <w:ind w:left="720" w:hanging="360"/>
         <w:rPr>
           <w:sz w:val="24"/>
@@ -27006,9 +27015,9 @@
       <w:pPr>
         <w:numPr>
           <w:ilvl w:val="0"/>
-          <w:numId w:val="13"/>
+          <w:numId w:val="5"/>
         </w:numPr>
-        <w:spacing w:after="0" w:afterAutospacing="0" w:before="0" w:beforeAutospacing="0" w:line="240" w:lineRule="auto"/>
+        <w:spacing w:after="0" w:before="0" w:line="240" w:lineRule="auto"/>
         <w:ind w:left="720" w:hanging="360"/>
         <w:rPr>
           <w:sz w:val="24"/>
@@ -27038,9 +27047,9 @@
       <w:pPr>
         <w:numPr>
           <w:ilvl w:val="0"/>
-          <w:numId w:val="13"/>
+          <w:numId w:val="5"/>
         </w:numPr>
-        <w:spacing w:after="240" w:before="0" w:beforeAutospacing="0" w:line="240" w:lineRule="auto"/>
+        <w:spacing w:after="240" w:before="0" w:line="240" w:lineRule="auto"/>
         <w:ind w:left="720" w:hanging="360"/>
         <w:rPr>
           <w:sz w:val="24"/>
@@ -27057,6 +27066,11 @@
         <w:t xml:space="preserve">Böngészők értelmezik és jelenítik meg</w:t>
         <w:br w:type="textWrapping"/>
       </w:r>
+      <w:r>
+        <w:rPr>
+          <w:rtl w:val="0"/>
+        </w:rPr>
+      </w:r>
     </w:p>
     <w:p>
       <w:pPr>
@@ -27322,7 +27336,7 @@
           <w:szCs w:val="24"/>
         </w:rPr>
       </w:pPr>
-      <w:bookmarkStart w:colFirst="0" w:colLast="0" w:name="_bfaq5lie2pv3" w:id="25"/>
+      <w:bookmarkStart w:colFirst="0" w:colLast="0" w:name="_h2xlkqy9s9om" w:id="25"/>
       <w:bookmarkEnd w:id="25"/>
       <w:r>
         <w:rPr>
@@ -27490,16 +27504,16 @@
           <wp:inline distB="114300" distT="114300" distL="114300" distR="114300">
             <wp:extent cx="5760410" cy="2514600"/>
             <wp:effectExtent b="0" l="0" r="0" t="0"/>
-            <wp:docPr id="18" name="image2.png"/>
+            <wp:docPr id="14" name="image18.png"/>
             <a:graphic>
               <a:graphicData uri="http://schemas.openxmlformats.org/drawingml/2006/picture">
                 <pic:pic>
                   <pic:nvPicPr>
-                    <pic:cNvPr id="0" name="image2.png"/>
+                    <pic:cNvPr id="0" name="image18.png"/>
                     <pic:cNvPicPr preferRelativeResize="0"/>
                   </pic:nvPicPr>
                   <pic:blipFill>
-                    <a:blip r:embed="rId21"/>
+                    <a:blip r:embed="rId23"/>
                     <a:srcRect b="0" l="0" r="0" t="0"/>
                     <a:stretch>
                       <a:fillRect/>
@@ -27562,9 +27576,9 @@
       <w:pPr>
         <w:numPr>
           <w:ilvl w:val="0"/>
-          <w:numId w:val="4"/>
+          <w:numId w:val="10"/>
         </w:numPr>
-        <w:spacing w:after="0" w:afterAutospacing="0" w:before="240" w:line="240" w:lineRule="auto"/>
+        <w:spacing w:after="0" w:before="240" w:line="240" w:lineRule="auto"/>
         <w:ind w:left="720" w:hanging="360"/>
         <w:rPr>
           <w:sz w:val="24"/>
@@ -27585,9 +27599,9 @@
       <w:pPr>
         <w:numPr>
           <w:ilvl w:val="0"/>
-          <w:numId w:val="4"/>
+          <w:numId w:val="10"/>
         </w:numPr>
-        <w:spacing w:after="0" w:afterAutospacing="0" w:before="0" w:beforeAutospacing="0" w:line="240" w:lineRule="auto"/>
+        <w:spacing w:after="0" w:before="0" w:line="240" w:lineRule="auto"/>
         <w:ind w:left="720" w:hanging="360"/>
         <w:rPr>
           <w:sz w:val="24"/>
@@ -27608,9 +27622,9 @@
       <w:pPr>
         <w:numPr>
           <w:ilvl w:val="0"/>
-          <w:numId w:val="4"/>
+          <w:numId w:val="10"/>
         </w:numPr>
-        <w:spacing w:after="0" w:afterAutospacing="0" w:before="0" w:beforeAutospacing="0" w:line="240" w:lineRule="auto"/>
+        <w:spacing w:after="0" w:before="0" w:line="240" w:lineRule="auto"/>
         <w:ind w:left="720" w:hanging="360"/>
         <w:rPr>
           <w:sz w:val="24"/>
@@ -27631,9 +27645,9 @@
       <w:pPr>
         <w:numPr>
           <w:ilvl w:val="0"/>
-          <w:numId w:val="4"/>
+          <w:numId w:val="10"/>
         </w:numPr>
-        <w:spacing w:after="240" w:before="0" w:beforeAutospacing="0" w:line="240" w:lineRule="auto"/>
+        <w:spacing w:after="240" w:before="0" w:line="240" w:lineRule="auto"/>
         <w:ind w:left="720" w:hanging="360"/>
         <w:rPr>
           <w:sz w:val="24"/>
@@ -27676,7 +27690,7 @@
           <w:szCs w:val="24"/>
         </w:rPr>
       </w:pPr>
-      <w:bookmarkStart w:colFirst="0" w:colLast="0" w:name="_ddtvoy9ydam8" w:id="26"/>
+      <w:bookmarkStart w:colFirst="0" w:colLast="0" w:name="_yt7v497e96hb" w:id="26"/>
       <w:bookmarkEnd w:id="26"/>
       <w:r>
         <w:rPr>
@@ -27727,9 +27741,9 @@
       <w:pPr>
         <w:numPr>
           <w:ilvl w:val="0"/>
-          <w:numId w:val="3"/>
+          <w:numId w:val="9"/>
         </w:numPr>
-        <w:spacing w:after="0" w:afterAutospacing="0" w:before="240" w:line="240" w:lineRule="auto"/>
+        <w:spacing w:after="0" w:before="240" w:line="240" w:lineRule="auto"/>
         <w:ind w:left="720" w:hanging="360"/>
         <w:rPr>
           <w:sz w:val="24"/>
@@ -27750,9 +27764,9 @@
       <w:pPr>
         <w:numPr>
           <w:ilvl w:val="0"/>
-          <w:numId w:val="3"/>
+          <w:numId w:val="9"/>
         </w:numPr>
-        <w:spacing w:after="0" w:afterAutospacing="0" w:before="0" w:beforeAutospacing="0" w:line="240" w:lineRule="auto"/>
+        <w:spacing w:after="0" w:before="0" w:line="240" w:lineRule="auto"/>
         <w:ind w:left="720" w:hanging="360"/>
         <w:rPr>
           <w:sz w:val="24"/>
@@ -27773,9 +27787,9 @@
       <w:pPr>
         <w:numPr>
           <w:ilvl w:val="0"/>
-          <w:numId w:val="3"/>
+          <w:numId w:val="9"/>
         </w:numPr>
-        <w:spacing w:after="0" w:afterAutospacing="0" w:before="0" w:beforeAutospacing="0" w:line="240" w:lineRule="auto"/>
+        <w:spacing w:after="0" w:before="0" w:line="240" w:lineRule="auto"/>
         <w:ind w:left="720" w:hanging="360"/>
         <w:rPr>
           <w:sz w:val="24"/>
@@ -27796,9 +27810,9 @@
       <w:pPr>
         <w:numPr>
           <w:ilvl w:val="0"/>
-          <w:numId w:val="3"/>
+          <w:numId w:val="9"/>
         </w:numPr>
-        <w:spacing w:after="240" w:before="0" w:beforeAutospacing="0" w:line="240" w:lineRule="auto"/>
+        <w:spacing w:after="240" w:before="0" w:line="240" w:lineRule="auto"/>
         <w:ind w:left="720" w:hanging="360"/>
         <w:rPr>
           <w:sz w:val="24"/>
@@ -27874,7 +27888,7 @@
         <w:spacing w:after="200" w:line="240" w:lineRule="auto"/>
         <w:rPr/>
       </w:pPr>
-      <w:bookmarkStart w:colFirst="0" w:colLast="0" w:name="_b0zbzxbjqekb" w:id="27"/>
+      <w:bookmarkStart w:colFirst="0" w:colLast="0" w:name="_c8192dcqjvjy" w:id="27"/>
       <w:bookmarkEnd w:id="27"/>
       <w:r>
         <w:rPr>
@@ -27917,16 +27931,16 @@
           <wp:inline distB="114300" distT="114300" distL="114300" distR="114300">
             <wp:extent cx="5760410" cy="4000500"/>
             <wp:effectExtent b="0" l="0" r="0" t="0"/>
-            <wp:docPr id="14" name="image15.png"/>
+            <wp:docPr id="15" name="image10.png"/>
             <a:graphic>
               <a:graphicData uri="http://schemas.openxmlformats.org/drawingml/2006/picture">
                 <pic:pic>
                   <pic:nvPicPr>
-                    <pic:cNvPr id="0" name="image15.png"/>
+                    <pic:cNvPr id="0" name="image10.png"/>
                     <pic:cNvPicPr preferRelativeResize="0"/>
                   </pic:nvPicPr>
                   <pic:blipFill>
-                    <a:blip r:embed="rId22"/>
+                    <a:blip r:embed="rId24"/>
                     <a:srcRect b="0" l="0" r="0" t="0"/>
                     <a:stretch>
                       <a:fillRect/>
@@ -27961,7 +27975,7 @@
           <w:szCs w:val="24"/>
         </w:rPr>
       </w:pPr>
-      <w:bookmarkStart w:colFirst="0" w:colLast="0" w:name="_haf6i7gn0nt7" w:id="28"/>
+      <w:bookmarkStart w:colFirst="0" w:colLast="0" w:name="_wk3rnnxumwk2" w:id="28"/>
       <w:bookmarkEnd w:id="28"/>
       <w:r>
         <w:rPr>
@@ -28012,7 +28026,7 @@
       <w:pPr>
         <w:numPr>
           <w:ilvl w:val="0"/>
-          <w:numId w:val="5"/>
+          <w:numId w:val="11"/>
         </w:numPr>
         <w:spacing w:after="0" w:before="240" w:line="240" w:lineRule="auto"/>
         <w:ind w:left="720" w:hanging="360"/>
@@ -28034,7 +28048,7 @@
       <w:pPr>
         <w:numPr>
           <w:ilvl w:val="0"/>
-          <w:numId w:val="5"/>
+          <w:numId w:val="11"/>
         </w:numPr>
         <w:spacing w:after="0" w:before="0" w:line="240" w:lineRule="auto"/>
         <w:ind w:left="720" w:hanging="360"/>
@@ -28056,7 +28070,7 @@
       <w:pPr>
         <w:numPr>
           <w:ilvl w:val="0"/>
-          <w:numId w:val="5"/>
+          <w:numId w:val="11"/>
         </w:numPr>
         <w:spacing w:after="0" w:before="0" w:line="240" w:lineRule="auto"/>
         <w:ind w:left="720" w:hanging="360"/>
@@ -28078,7 +28092,7 @@
       <w:pPr>
         <w:numPr>
           <w:ilvl w:val="0"/>
-          <w:numId w:val="5"/>
+          <w:numId w:val="11"/>
         </w:numPr>
         <w:spacing w:after="240" w:before="0" w:line="240" w:lineRule="auto"/>
         <w:ind w:left="720" w:hanging="360"/>
@@ -28108,7 +28122,7 @@
           <w:szCs w:val="24"/>
         </w:rPr>
       </w:pPr>
-      <w:bookmarkStart w:colFirst="0" w:colLast="0" w:name="_k0nssbg41xm0" w:id="29"/>
+      <w:bookmarkStart w:colFirst="0" w:colLast="0" w:name="_tgkts5e52cwx" w:id="29"/>
       <w:bookmarkEnd w:id="29"/>
       <w:r>
         <w:rPr>
@@ -28130,16 +28144,16 @@
           <wp:inline distB="114300" distT="114300" distL="114300" distR="114300">
             <wp:extent cx="5760410" cy="1016000"/>
             <wp:effectExtent b="0" l="0" r="0" t="0"/>
-            <wp:docPr id="12" name="image8.png"/>
+            <wp:docPr id="16" name="image12.png"/>
             <a:graphic>
               <a:graphicData uri="http://schemas.openxmlformats.org/drawingml/2006/picture">
                 <pic:pic>
                   <pic:nvPicPr>
-                    <pic:cNvPr id="0" name="image8.png"/>
+                    <pic:cNvPr id="0" name="image12.png"/>
                     <pic:cNvPicPr preferRelativeResize="0"/>
                   </pic:nvPicPr>
                   <pic:blipFill>
-                    <a:blip r:embed="rId23"/>
+                    <a:blip r:embed="rId25"/>
                     <a:srcRect b="0" l="0" r="0" t="0"/>
                     <a:stretch>
                       <a:fillRect/>
@@ -28186,7 +28200,7 @@
           <w:szCs w:val="24"/>
         </w:rPr>
       </w:pPr>
-      <w:bookmarkStart w:colFirst="0" w:colLast="0" w:name="_teol1e7e64di" w:id="30"/>
+      <w:bookmarkStart w:colFirst="0" w:colLast="0" w:name="_c2ncjpd30hgq" w:id="30"/>
       <w:bookmarkEnd w:id="30"/>
       <w:r>
         <w:rPr>
@@ -28202,7 +28216,7 @@
       <w:pPr>
         <w:numPr>
           <w:ilvl w:val="0"/>
-          <w:numId w:val="8"/>
+          <w:numId w:val="14"/>
         </w:numPr>
         <w:spacing w:after="0" w:before="240" w:lineRule="auto"/>
         <w:ind w:left="720" w:hanging="360"/>
@@ -28224,7 +28238,7 @@
       <w:pPr>
         <w:numPr>
           <w:ilvl w:val="0"/>
-          <w:numId w:val="8"/>
+          <w:numId w:val="14"/>
         </w:numPr>
         <w:spacing w:after="240" w:before="0" w:lineRule="auto"/>
         <w:ind w:left="720" w:hanging="360"/>
@@ -28268,7 +28282,7 @@
           <w:szCs w:val="24"/>
         </w:rPr>
       </w:pPr>
-      <w:bookmarkStart w:colFirst="0" w:colLast="0" w:name="_un9ugafc43p9" w:id="31"/>
+      <w:bookmarkStart w:colFirst="0" w:colLast="0" w:name="_wrh6du878ovm" w:id="31"/>
       <w:bookmarkEnd w:id="31"/>
       <w:r>
         <w:rPr>
@@ -28308,7 +28322,7 @@
           <w:szCs w:val="24"/>
         </w:rPr>
       </w:pPr>
-      <w:bookmarkStart w:colFirst="0" w:colLast="0" w:name="_d02oeyj94x2k" w:id="32"/>
+      <w:bookmarkStart w:colFirst="0" w:colLast="0" w:name="_l1k5np8syv8y" w:id="32"/>
       <w:bookmarkEnd w:id="32"/>
       <w:r>
         <w:rPr>
@@ -28324,7 +28338,7 @@
       <w:pPr>
         <w:numPr>
           <w:ilvl w:val="0"/>
-          <w:numId w:val="9"/>
+          <w:numId w:val="15"/>
         </w:numPr>
         <w:spacing w:after="0" w:before="240" w:line="240" w:lineRule="auto"/>
         <w:ind w:left="720" w:hanging="360"/>
@@ -28346,7 +28360,7 @@
       <w:pPr>
         <w:numPr>
           <w:ilvl w:val="0"/>
-          <w:numId w:val="9"/>
+          <w:numId w:val="15"/>
         </w:numPr>
         <w:spacing w:after="0" w:before="0" w:line="240" w:lineRule="auto"/>
         <w:ind w:left="720" w:hanging="360"/>
@@ -28368,7 +28382,7 @@
       <w:pPr>
         <w:numPr>
           <w:ilvl w:val="0"/>
-          <w:numId w:val="9"/>
+          <w:numId w:val="15"/>
         </w:numPr>
         <w:spacing w:after="0" w:before="0" w:line="240" w:lineRule="auto"/>
         <w:ind w:left="720" w:hanging="360"/>
@@ -28390,7 +28404,7 @@
       <w:pPr>
         <w:numPr>
           <w:ilvl w:val="0"/>
-          <w:numId w:val="9"/>
+          <w:numId w:val="15"/>
         </w:numPr>
         <w:spacing w:after="0" w:before="0" w:line="240" w:lineRule="auto"/>
         <w:ind w:left="720" w:hanging="360"/>
@@ -28412,7 +28426,7 @@
       <w:pPr>
         <w:numPr>
           <w:ilvl w:val="0"/>
-          <w:numId w:val="9"/>
+          <w:numId w:val="15"/>
         </w:numPr>
         <w:spacing w:after="240" w:before="0" w:line="240" w:lineRule="auto"/>
         <w:ind w:left="720" w:hanging="360"/>
@@ -28442,7 +28456,7 @@
           <w:szCs w:val="24"/>
         </w:rPr>
       </w:pPr>
-      <w:bookmarkStart w:colFirst="0" w:colLast="0" w:name="_yjlr8zt0qai9" w:id="33"/>
+      <w:bookmarkStart w:colFirst="0" w:colLast="0" w:name="_at1go4c2ie44" w:id="33"/>
       <w:bookmarkEnd w:id="33"/>
       <w:r>
         <w:rPr>
@@ -28458,7 +28472,7 @@
       <w:pPr>
         <w:numPr>
           <w:ilvl w:val="0"/>
-          <w:numId w:val="11"/>
+          <w:numId w:val="3"/>
         </w:numPr>
         <w:spacing w:after="0" w:before="240" w:line="240" w:lineRule="auto"/>
         <w:ind w:left="720" w:hanging="360"/>
@@ -28480,7 +28494,7 @@
       <w:pPr>
         <w:numPr>
           <w:ilvl w:val="0"/>
-          <w:numId w:val="11"/>
+          <w:numId w:val="3"/>
         </w:numPr>
         <w:spacing w:after="0" w:before="0" w:line="240" w:lineRule="auto"/>
         <w:ind w:left="720" w:hanging="360"/>
@@ -28502,7 +28516,7 @@
       <w:pPr>
         <w:numPr>
           <w:ilvl w:val="0"/>
-          <w:numId w:val="11"/>
+          <w:numId w:val="3"/>
         </w:numPr>
         <w:spacing w:after="240" w:before="0" w:line="240" w:lineRule="auto"/>
         <w:ind w:left="720" w:hanging="360"/>
@@ -28529,7 +28543,7 @@
           <w:szCs w:val="24"/>
         </w:rPr>
       </w:pPr>
-      <w:bookmarkStart w:colFirst="0" w:colLast="0" w:name="_cq4gzu3xou2z" w:id="34"/>
+      <w:bookmarkStart w:colFirst="0" w:colLast="0" w:name="_k9c5ym7enzyu" w:id="34"/>
       <w:bookmarkEnd w:id="34"/>
       <w:r>
         <w:rPr>
@@ -28561,7 +28575,7 @@
       <w:pPr>
         <w:numPr>
           <w:ilvl w:val="0"/>
-          <w:numId w:val="10"/>
+          <w:numId w:val="2"/>
         </w:numPr>
         <w:spacing w:after="0" w:before="240" w:line="240" w:lineRule="auto"/>
         <w:ind w:left="720" w:hanging="360"/>
@@ -28583,7 +28597,7 @@
       <w:pPr>
         <w:numPr>
           <w:ilvl w:val="0"/>
-          <w:numId w:val="10"/>
+          <w:numId w:val="2"/>
         </w:numPr>
         <w:spacing w:after="0" w:before="0" w:line="240" w:lineRule="auto"/>
         <w:ind w:left="720" w:hanging="360"/>
@@ -28605,7 +28619,7 @@
       <w:pPr>
         <w:numPr>
           <w:ilvl w:val="0"/>
-          <w:numId w:val="10"/>
+          <w:numId w:val="2"/>
         </w:numPr>
         <w:spacing w:after="0" w:before="0" w:line="240" w:lineRule="auto"/>
         <w:ind w:left="720" w:hanging="360"/>
@@ -28627,7 +28641,7 @@
       <w:pPr>
         <w:numPr>
           <w:ilvl w:val="0"/>
-          <w:numId w:val="10"/>
+          <w:numId w:val="2"/>
         </w:numPr>
         <w:spacing w:after="0" w:before="0" w:line="240" w:lineRule="auto"/>
         <w:ind w:left="720" w:hanging="360"/>
@@ -28649,7 +28663,7 @@
       <w:pPr>
         <w:numPr>
           <w:ilvl w:val="0"/>
-          <w:numId w:val="10"/>
+          <w:numId w:val="2"/>
         </w:numPr>
         <w:spacing w:after="240" w:before="0" w:line="240" w:lineRule="auto"/>
         <w:ind w:left="720" w:hanging="360"/>
@@ -28685,16 +28699,16 @@
           <wp:inline distB="114300" distT="114300" distL="114300" distR="114300">
             <wp:extent cx="5760410" cy="3721100"/>
             <wp:effectExtent b="0" l="0" r="0" t="0"/>
-            <wp:docPr id="13" name="image16.png"/>
+            <wp:docPr id="17" name="image8.png"/>
             <a:graphic>
               <a:graphicData uri="http://schemas.openxmlformats.org/drawingml/2006/picture">
                 <pic:pic>
                   <pic:nvPicPr>
-                    <pic:cNvPr id="0" name="image16.png"/>
+                    <pic:cNvPr id="0" name="image8.png"/>
                     <pic:cNvPicPr preferRelativeResize="0"/>
                   </pic:nvPicPr>
                   <pic:blipFill>
-                    <a:blip r:embed="rId24"/>
+                    <a:blip r:embed="rId26"/>
                     <a:srcRect b="0" l="0" r="0" t="0"/>
                     <a:stretch>
                       <a:fillRect/>
@@ -28732,7 +28746,7 @@
           <w:szCs w:val="24"/>
         </w:rPr>
       </w:pPr>
-      <w:bookmarkStart w:colFirst="0" w:colLast="0" w:name="_qqzoar78w8xr" w:id="35"/>
+      <w:bookmarkStart w:colFirst="0" w:colLast="0" w:name="_lentizt4lnqm" w:id="35"/>
       <w:bookmarkEnd w:id="35"/>
       <w:r>
         <w:rPr>
@@ -28748,7 +28762,7 @@
       <w:pPr>
         <w:numPr>
           <w:ilvl w:val="0"/>
-          <w:numId w:val="6"/>
+          <w:numId w:val="12"/>
         </w:numPr>
         <w:spacing w:after="0" w:before="240" w:line="240" w:lineRule="auto"/>
         <w:ind w:left="720" w:hanging="360"/>
@@ -28770,7 +28784,7 @@
       <w:pPr>
         <w:numPr>
           <w:ilvl w:val="0"/>
-          <w:numId w:val="6"/>
+          <w:numId w:val="12"/>
         </w:numPr>
         <w:spacing w:after="0" w:before="0" w:line="240" w:lineRule="auto"/>
         <w:ind w:left="720" w:hanging="360"/>
@@ -28792,7 +28806,7 @@
       <w:pPr>
         <w:numPr>
           <w:ilvl w:val="0"/>
-          <w:numId w:val="6"/>
+          <w:numId w:val="12"/>
         </w:numPr>
         <w:spacing w:after="240" w:before="0" w:line="240" w:lineRule="auto"/>
         <w:ind w:left="720" w:hanging="360"/>
@@ -28822,7 +28836,7 @@
           <w:szCs w:val="24"/>
         </w:rPr>
       </w:pPr>
-      <w:bookmarkStart w:colFirst="0" w:colLast="0" w:name="_enhr6kfs4kc3" w:id="36"/>
+      <w:bookmarkStart w:colFirst="0" w:colLast="0" w:name="_dk9e0833rw41" w:id="36"/>
       <w:bookmarkEnd w:id="36"/>
       <w:r>
         <w:rPr>
@@ -28838,7 +28852,7 @@
       <w:pPr>
         <w:numPr>
           <w:ilvl w:val="0"/>
-          <w:numId w:val="7"/>
+          <w:numId w:val="13"/>
         </w:numPr>
         <w:spacing w:after="0" w:before="240" w:line="240" w:lineRule="auto"/>
         <w:ind w:left="720" w:hanging="360"/>
@@ -28860,7 +28874,7 @@
       <w:pPr>
         <w:numPr>
           <w:ilvl w:val="0"/>
-          <w:numId w:val="7"/>
+          <w:numId w:val="13"/>
         </w:numPr>
         <w:spacing w:after="0" w:before="0" w:line="240" w:lineRule="auto"/>
         <w:ind w:left="720" w:hanging="360"/>
@@ -28882,7 +28896,7 @@
       <w:pPr>
         <w:numPr>
           <w:ilvl w:val="0"/>
-          <w:numId w:val="7"/>
+          <w:numId w:val="13"/>
         </w:numPr>
         <w:spacing w:after="0" w:before="0" w:line="240" w:lineRule="auto"/>
         <w:ind w:left="720" w:hanging="360"/>
@@ -28940,7 +28954,7 @@
       <w:pPr>
         <w:numPr>
           <w:ilvl w:val="0"/>
-          <w:numId w:val="7"/>
+          <w:numId w:val="13"/>
         </w:numPr>
         <w:spacing w:after="240" w:before="0" w:line="240" w:lineRule="auto"/>
         <w:ind w:left="720" w:hanging="360"/>
@@ -28974,11 +28988,6 @@
           <w:rtl w:val="0"/>
         </w:rPr>
         <w:t xml:space="preserve"> címen.</w:t>
-      </w:r>
-      <w:r>
-        <w:rPr>
-          <w:rtl w:val="0"/>
-        </w:rPr>
       </w:r>
     </w:p>
     <w:p>
@@ -28999,16 +29008,16 @@
           <wp:inline distB="114300" distT="114300" distL="114300" distR="114300">
             <wp:extent cx="5760410" cy="2679700"/>
             <wp:effectExtent b="0" l="0" r="0" t="0"/>
-            <wp:docPr id="15" name="image14.png"/>
+            <wp:docPr id="18" name="image16.png"/>
             <a:graphic>
               <a:graphicData uri="http://schemas.openxmlformats.org/drawingml/2006/picture">
                 <pic:pic>
                   <pic:nvPicPr>
-                    <pic:cNvPr id="0" name="image14.png"/>
+                    <pic:cNvPr id="0" name="image16.png"/>
                     <pic:cNvPicPr preferRelativeResize="0"/>
                   </pic:nvPicPr>
                   <pic:blipFill>
-                    <a:blip r:embed="rId25"/>
+                    <a:blip r:embed="rId27"/>
                     <a:srcRect b="0" l="0" r="0" t="0"/>
                     <a:stretch>
                       <a:fillRect/>
@@ -29049,7 +29058,7 @@
       </w:r>
     </w:p>
     <w:sectPr>
-      <w:footerReference r:id="rId26" w:type="default"/>
+      <w:footerReference r:id="rId28" w:type="default"/>
       <w:type w:val="nextPage"/>
       <w:pgSz w:h="16838" w:w="11906" w:orient="portrait"/>
       <w:pgMar w:bottom="1417" w:top="1417" w:left="1417" w:right="1417" w:header="708" w:footer="708"/>
@@ -29403,19 +29412,7 @@
       </w:rPr>
     </w:pPr>
     <w:r>
-      <w:rPr>
-        <w:rFonts w:ascii="Calibri" w:cs="Calibri" w:eastAsia="Calibri" w:hAnsi="Calibri"/>
-        <w:b w:val="0"/>
-        <w:i w:val="0"/>
-        <w:smallCaps w:val="0"/>
-        <w:strike w:val="0"/>
-        <w:color w:val="000000"/>
-        <w:sz w:val="22"/>
-        <w:szCs w:val="22"/>
-        <w:u w:val="none"/>
-        <w:shd w:fill="auto" w:val="clear"/>
-        <w:vertAlign w:val="baseline"/>
-      </w:rPr>
+      <w:rPr/>
       <w:fldChar w:fldCharType="begin"/>
       <w:instrText xml:space="preserve">PAGE</w:instrText>
       <w:fldChar w:fldCharType="separate"/>
@@ -29427,39 +29424,36 @@
       </w:rPr>
     </w:r>
   </w:p>
+</w:ftr>
+</file>
+
+<file path=word/footer4.xml><?xml version="1.0" encoding="utf-8"?>
+<w:ftr xmlns:mc="http://schemas.openxmlformats.org/markup-compatibility/2006" xmlns:o="urn:schemas-microsoft-com:office:office" xmlns:r="http://schemas.openxmlformats.org/officeDocument/2006/relationships" xmlns:m="http://schemas.openxmlformats.org/officeDocument/2006/math" xmlns:v="urn:schemas-microsoft-com:vml" xmlns:wp="http://schemas.openxmlformats.org/drawingml/2006/wordprocessingDrawing" xmlns:w10="urn:schemas-microsoft-com:office:word" xmlns:w="http://schemas.openxmlformats.org/wordprocessingml/2006/main" xmlns:wne="http://schemas.microsoft.com/office/word/2006/wordml" xmlns:sl="http://schemas.openxmlformats.org/schemaLibrary/2006/main" xmlns:a="http://schemas.openxmlformats.org/drawingml/2006/main" xmlns:pic="http://schemas.openxmlformats.org/drawingml/2006/picture" xmlns:c="http://schemas.openxmlformats.org/drawingml/2006/chart" xmlns:lc="http://schemas.openxmlformats.org/drawingml/2006/lockedCanvas" xmlns:dgm="http://schemas.openxmlformats.org/drawingml/2006/diagram" xmlns:wps="http://schemas.microsoft.com/office/word/2010/wordprocessingShape" xmlns:wpg="http://schemas.microsoft.com/office/word/2010/wordprocessingGroup" xmlns:w14="http://schemas.microsoft.com/office/word/2010/wordml" xmlns:w15="http://schemas.microsoft.com/office/word/2012/wordml" xmlns:w16="http://schemas.microsoft.com/office/word/2018/wordml" xmlns:w16cex="http://schemas.microsoft.com/office/word/2018/wordml/cex" xmlns:w16cid="http://schemas.microsoft.com/office/word/2016/wordml/cid" xmlns="http://schemas.microsoft.com/office/tasks/2019/documenttasks" xmlns:cr="http://schemas.microsoft.com/office/comments/2020/reactions">
   <w:p>
     <w:pPr>
-      <w:keepNext w:val="0"/>
-      <w:keepLines w:val="0"/>
-      <w:widowControl w:val="1"/>
-      <w:pBdr>
-        <w:top w:space="0" w:sz="0" w:val="nil"/>
-        <w:left w:space="0" w:sz="0" w:val="nil"/>
-        <w:bottom w:space="0" w:sz="0" w:val="nil"/>
-        <w:right w:space="0" w:sz="0" w:val="nil"/>
-        <w:between w:space="0" w:sz="0" w:val="nil"/>
-      </w:pBdr>
-      <w:shd w:fill="auto" w:val="clear"/>
-      <w:tabs>
-        <w:tab w:val="center" w:leader="none" w:pos="4536"/>
-        <w:tab w:val="right" w:leader="none" w:pos="9072"/>
-      </w:tabs>
-      <w:spacing w:after="0" w:before="0" w:line="240" w:lineRule="auto"/>
-      <w:ind w:left="0" w:right="0" w:firstLine="0"/>
-      <w:jc w:val="center"/>
+      <w:rPr/>
+    </w:pPr>
+    <w:r>
+      <w:rPr/>
+      <w:fldChar w:fldCharType="begin"/>
+      <w:instrText xml:space="preserve">PAGE</w:instrText>
+      <w:fldChar w:fldCharType="separate"/>
+      <w:fldChar w:fldCharType="end"/>
+    </w:r>
+    <w:r>
       <w:rPr>
-        <w:rFonts w:ascii="Calibri" w:cs="Calibri" w:eastAsia="Calibri" w:hAnsi="Calibri"/>
-        <w:b w:val="0"/>
-        <w:i w:val="0"/>
-        <w:smallCaps w:val="0"/>
-        <w:strike w:val="0"/>
-        <w:color w:val="000000"/>
-        <w:sz w:val="22"/>
-        <w:szCs w:val="22"/>
-        <w:u w:val="none"/>
-        <w:shd w:fill="auto" w:val="clear"/>
-        <w:vertAlign w:val="baseline"/>
+        <w:rtl w:val="0"/>
       </w:rPr>
+    </w:r>
+  </w:p>
+</w:ftr>
+</file>
+
+<file path=word/header1.xml><?xml version="1.0" encoding="utf-8"?>
+<w:hdr xmlns:mc="http://schemas.openxmlformats.org/markup-compatibility/2006" xmlns:o="urn:schemas-microsoft-com:office:office" xmlns:r="http://schemas.openxmlformats.org/officeDocument/2006/relationships" xmlns:m="http://schemas.openxmlformats.org/officeDocument/2006/math" xmlns:v="urn:schemas-microsoft-com:vml" xmlns:wp="http://schemas.openxmlformats.org/drawingml/2006/wordprocessingDrawing" xmlns:w10="urn:schemas-microsoft-com:office:word" xmlns:w="http://schemas.openxmlformats.org/wordprocessingml/2006/main" xmlns:wne="http://schemas.microsoft.com/office/word/2006/wordml" xmlns:sl="http://schemas.openxmlformats.org/schemaLibrary/2006/main" xmlns:a="http://schemas.openxmlformats.org/drawingml/2006/main" xmlns:pic="http://schemas.openxmlformats.org/drawingml/2006/picture" xmlns:c="http://schemas.openxmlformats.org/drawingml/2006/chart" xmlns:lc="http://schemas.openxmlformats.org/drawingml/2006/lockedCanvas" xmlns:dgm="http://schemas.openxmlformats.org/drawingml/2006/diagram" xmlns:wps="http://schemas.microsoft.com/office/word/2010/wordprocessingShape" xmlns:wpg="http://schemas.microsoft.com/office/word/2010/wordprocessingGroup" xmlns:w14="http://schemas.microsoft.com/office/word/2010/wordml" xmlns:w15="http://schemas.microsoft.com/office/word/2012/wordml" xmlns:w16="http://schemas.microsoft.com/office/word/2018/wordml" xmlns:w16cex="http://schemas.microsoft.com/office/word/2018/wordml/cex" xmlns:w16cid="http://schemas.microsoft.com/office/word/2016/wordml/cid" xmlns="http://schemas.microsoft.com/office/tasks/2019/documenttasks" xmlns:cr="http://schemas.microsoft.com/office/comments/2020/reactions">
+  <w:p>
+    <w:pPr>
+      <w:rPr/>
     </w:pPr>
     <w:r>
       <w:rPr>
@@ -29467,47 +29461,7 @@
       </w:rPr>
     </w:r>
   </w:p>
-  <w:p>
-    <w:pPr>
-      <w:keepNext w:val="0"/>
-      <w:keepLines w:val="0"/>
-      <w:widowControl w:val="1"/>
-      <w:pBdr>
-        <w:top w:space="0" w:sz="0" w:val="nil"/>
-        <w:left w:space="0" w:sz="0" w:val="nil"/>
-        <w:bottom w:space="0" w:sz="0" w:val="nil"/>
-        <w:right w:space="0" w:sz="0" w:val="nil"/>
-        <w:between w:space="0" w:sz="0" w:val="nil"/>
-      </w:pBdr>
-      <w:shd w:fill="auto" w:val="clear"/>
-      <w:tabs>
-        <w:tab w:val="center" w:leader="none" w:pos="4536"/>
-        <w:tab w:val="right" w:leader="none" w:pos="9072"/>
-      </w:tabs>
-      <w:spacing w:after="0" w:before="0" w:line="240" w:lineRule="auto"/>
-      <w:ind w:left="0" w:right="0" w:firstLine="0"/>
-      <w:jc w:val="center"/>
-      <w:rPr>
-        <w:rFonts w:ascii="Calibri" w:cs="Calibri" w:eastAsia="Calibri" w:hAnsi="Calibri"/>
-        <w:b w:val="0"/>
-        <w:i w:val="0"/>
-        <w:smallCaps w:val="0"/>
-        <w:strike w:val="0"/>
-        <w:color w:val="000000"/>
-        <w:sz w:val="22"/>
-        <w:szCs w:val="22"/>
-        <w:u w:val="none"/>
-        <w:shd w:fill="auto" w:val="clear"/>
-        <w:vertAlign w:val="baseline"/>
-      </w:rPr>
-    </w:pPr>
-    <w:r>
-      <w:rPr>
-        <w:rtl w:val="0"/>
-      </w:rPr>
-    </w:r>
-  </w:p>
-</w:ftr>
+</w:hdr>
 </file>
 
 <file path=word/numbering.xml><?xml version="1.0" encoding="utf-8"?>
@@ -30175,8 +30129,8 @@
   <w:abstractNum w:abstractNumId="7">
     <w:lvl w:ilvl="0">
       <w:start w:val="1"/>
-      <w:numFmt w:val="decimal"/>
-      <w:lvlText w:val="%1."/>
+      <w:numFmt w:val="bullet"/>
+      <w:lvlText w:val="●"/>
       <w:lvlJc w:val="left"/>
       <w:pPr>
         <w:ind w:left="720" w:hanging="360"/>
@@ -30187,8 +30141,8 @@
     </w:lvl>
     <w:lvl w:ilvl="1">
       <w:start w:val="1"/>
-      <w:numFmt w:val="lowerLetter"/>
-      <w:lvlText w:val="%2."/>
+      <w:numFmt w:val="bullet"/>
+      <w:lvlText w:val="○"/>
       <w:lvlJc w:val="left"/>
       <w:pPr>
         <w:ind w:left="1440" w:hanging="360"/>
@@ -30199,8 +30153,8 @@
     </w:lvl>
     <w:lvl w:ilvl="2">
       <w:start w:val="1"/>
-      <w:numFmt w:val="lowerRoman"/>
-      <w:lvlText w:val="%3."/>
+      <w:numFmt w:val="bullet"/>
+      <w:lvlText w:val="■"/>
       <w:lvlJc w:val="left"/>
       <w:pPr>
         <w:ind w:left="2160" w:hanging="360"/>
@@ -30211,8 +30165,8 @@
     </w:lvl>
     <w:lvl w:ilvl="3">
       <w:start w:val="1"/>
-      <w:numFmt w:val="decimal"/>
-      <w:lvlText w:val="%4."/>
+      <w:numFmt w:val="bullet"/>
+      <w:lvlText w:val="●"/>
       <w:lvlJc w:val="left"/>
       <w:pPr>
         <w:ind w:left="2880" w:hanging="360"/>
@@ -30223,8 +30177,8 @@
     </w:lvl>
     <w:lvl w:ilvl="4">
       <w:start w:val="1"/>
-      <w:numFmt w:val="lowerLetter"/>
-      <w:lvlText w:val="%5."/>
+      <w:numFmt w:val="bullet"/>
+      <w:lvlText w:val="○"/>
       <w:lvlJc w:val="left"/>
       <w:pPr>
         <w:ind w:left="3600" w:hanging="360"/>
@@ -30235,8 +30189,8 @@
     </w:lvl>
     <w:lvl w:ilvl="5">
       <w:start w:val="1"/>
-      <w:numFmt w:val="lowerRoman"/>
-      <w:lvlText w:val="%6."/>
+      <w:numFmt w:val="bullet"/>
+      <w:lvlText w:val="■"/>
       <w:lvlJc w:val="left"/>
       <w:pPr>
         <w:ind w:left="4320" w:hanging="360"/>
@@ -30247,8 +30201,8 @@
     </w:lvl>
     <w:lvl w:ilvl="6">
       <w:start w:val="1"/>
-      <w:numFmt w:val="decimal"/>
-      <w:lvlText w:val="%7."/>
+      <w:numFmt w:val="bullet"/>
+      <w:lvlText w:val="●"/>
       <w:lvlJc w:val="left"/>
       <w:pPr>
         <w:ind w:left="5040" w:hanging="360"/>
@@ -30259,8 +30213,8 @@
     </w:lvl>
     <w:lvl w:ilvl="7">
       <w:start w:val="1"/>
-      <w:numFmt w:val="lowerLetter"/>
-      <w:lvlText w:val="%8."/>
+      <w:numFmt w:val="bullet"/>
+      <w:lvlText w:val="○"/>
       <w:lvlJc w:val="left"/>
       <w:pPr>
         <w:ind w:left="5760" w:hanging="360"/>
@@ -30271,8 +30225,8 @@
     </w:lvl>
     <w:lvl w:ilvl="8">
       <w:start w:val="1"/>
-      <w:numFmt w:val="lowerRoman"/>
-      <w:lvlText w:val="%9."/>
+      <w:numFmt w:val="bullet"/>
+      <w:lvlText w:val="■"/>
       <w:lvlJc w:val="left"/>
       <w:pPr>
         <w:ind w:left="6480" w:hanging="360"/>
@@ -30285,8 +30239,8 @@
   <w:abstractNum w:abstractNumId="8">
     <w:lvl w:ilvl="0">
       <w:start w:val="1"/>
-      <w:numFmt w:val="decimal"/>
-      <w:lvlText w:val="%1."/>
+      <w:numFmt w:val="bullet"/>
+      <w:lvlText w:val="●"/>
       <w:lvlJc w:val="left"/>
       <w:pPr>
         <w:ind w:left="720" w:hanging="360"/>
@@ -30297,8 +30251,8 @@
     </w:lvl>
     <w:lvl w:ilvl="1">
       <w:start w:val="1"/>
-      <w:numFmt w:val="lowerLetter"/>
-      <w:lvlText w:val="%2."/>
+      <w:numFmt w:val="bullet"/>
+      <w:lvlText w:val="○"/>
       <w:lvlJc w:val="left"/>
       <w:pPr>
         <w:ind w:left="1440" w:hanging="360"/>
@@ -30309,8 +30263,8 @@
     </w:lvl>
     <w:lvl w:ilvl="2">
       <w:start w:val="1"/>
-      <w:numFmt w:val="lowerRoman"/>
-      <w:lvlText w:val="%3."/>
+      <w:numFmt w:val="bullet"/>
+      <w:lvlText w:val="■"/>
       <w:lvlJc w:val="left"/>
       <w:pPr>
         <w:ind w:left="2160" w:hanging="360"/>
@@ -30321,8 +30275,8 @@
     </w:lvl>
     <w:lvl w:ilvl="3">
       <w:start w:val="1"/>
-      <w:numFmt w:val="decimal"/>
-      <w:lvlText w:val="%4."/>
+      <w:numFmt w:val="bullet"/>
+      <w:lvlText w:val="●"/>
       <w:lvlJc w:val="left"/>
       <w:pPr>
         <w:ind w:left="2880" w:hanging="360"/>
@@ -30333,8 +30287,8 @@
     </w:lvl>
     <w:lvl w:ilvl="4">
       <w:start w:val="1"/>
-      <w:numFmt w:val="lowerLetter"/>
-      <w:lvlText w:val="%5."/>
+      <w:numFmt w:val="bullet"/>
+      <w:lvlText w:val="○"/>
       <w:lvlJc w:val="left"/>
       <w:pPr>
         <w:ind w:left="3600" w:hanging="360"/>
@@ -30345,8 +30299,8 @@
     </w:lvl>
     <w:lvl w:ilvl="5">
       <w:start w:val="1"/>
-      <w:numFmt w:val="lowerRoman"/>
-      <w:lvlText w:val="%6."/>
+      <w:numFmt w:val="bullet"/>
+      <w:lvlText w:val="■"/>
       <w:lvlJc w:val="left"/>
       <w:pPr>
         <w:ind w:left="4320" w:hanging="360"/>
@@ -30357,8 +30311,8 @@
     </w:lvl>
     <w:lvl w:ilvl="6">
       <w:start w:val="1"/>
-      <w:numFmt w:val="decimal"/>
-      <w:lvlText w:val="%7."/>
+      <w:numFmt w:val="bullet"/>
+      <w:lvlText w:val="●"/>
       <w:lvlJc w:val="left"/>
       <w:pPr>
         <w:ind w:left="5040" w:hanging="360"/>
@@ -30369,8 +30323,8 @@
     </w:lvl>
     <w:lvl w:ilvl="7">
       <w:start w:val="1"/>
-      <w:numFmt w:val="lowerLetter"/>
-      <w:lvlText w:val="%8."/>
+      <w:numFmt w:val="bullet"/>
+      <w:lvlText w:val="○"/>
       <w:lvlJc w:val="left"/>
       <w:pPr>
         <w:ind w:left="5760" w:hanging="360"/>
@@ -30381,8 +30335,8 @@
     </w:lvl>
     <w:lvl w:ilvl="8">
       <w:start w:val="1"/>
-      <w:numFmt w:val="lowerRoman"/>
-      <w:lvlText w:val="%9."/>
+      <w:numFmt w:val="bullet"/>
+      <w:lvlText w:val="■"/>
       <w:lvlJc w:val="left"/>
       <w:pPr>
         <w:ind w:left="6480" w:hanging="360"/>
@@ -30835,8 +30789,8 @@
   <w:abstractNum w:abstractNumId="13">
     <w:lvl w:ilvl="0">
       <w:start w:val="1"/>
-      <w:numFmt w:val="bullet"/>
-      <w:lvlText w:val="●"/>
+      <w:numFmt w:val="decimal"/>
+      <w:lvlText w:val="%1."/>
       <w:lvlJc w:val="left"/>
       <w:pPr>
         <w:ind w:left="720" w:hanging="360"/>
@@ -30847,8 +30801,8 @@
     </w:lvl>
     <w:lvl w:ilvl="1">
       <w:start w:val="1"/>
-      <w:numFmt w:val="bullet"/>
-      <w:lvlText w:val="○"/>
+      <w:numFmt w:val="lowerLetter"/>
+      <w:lvlText w:val="%2."/>
       <w:lvlJc w:val="left"/>
       <w:pPr>
         <w:ind w:left="1440" w:hanging="360"/>
@@ -30859,8 +30813,8 @@
     </w:lvl>
     <w:lvl w:ilvl="2">
       <w:start w:val="1"/>
-      <w:numFmt w:val="bullet"/>
-      <w:lvlText w:val="■"/>
+      <w:numFmt w:val="lowerRoman"/>
+      <w:lvlText w:val="%3."/>
       <w:lvlJc w:val="left"/>
       <w:pPr>
         <w:ind w:left="2160" w:hanging="360"/>
@@ -30871,8 +30825,8 @@
     </w:lvl>
     <w:lvl w:ilvl="3">
       <w:start w:val="1"/>
-      <w:numFmt w:val="bullet"/>
-      <w:lvlText w:val="●"/>
+      <w:numFmt w:val="decimal"/>
+      <w:lvlText w:val="%4."/>
       <w:lvlJc w:val="left"/>
       <w:pPr>
         <w:ind w:left="2880" w:hanging="360"/>
@@ -30883,8 +30837,8 @@
     </w:lvl>
     <w:lvl w:ilvl="4">
       <w:start w:val="1"/>
-      <w:numFmt w:val="bullet"/>
-      <w:lvlText w:val="○"/>
+      <w:numFmt w:val="lowerLetter"/>
+      <w:lvlText w:val="%5."/>
       <w:lvlJc w:val="left"/>
       <w:pPr>
         <w:ind w:left="3600" w:hanging="360"/>
@@ -30895,8 +30849,8 @@
     </w:lvl>
     <w:lvl w:ilvl="5">
       <w:start w:val="1"/>
-      <w:numFmt w:val="bullet"/>
-      <w:lvlText w:val="■"/>
+      <w:numFmt w:val="lowerRoman"/>
+      <w:lvlText w:val="%6."/>
       <w:lvlJc w:val="left"/>
       <w:pPr>
         <w:ind w:left="4320" w:hanging="360"/>
@@ -30907,8 +30861,8 @@
     </w:lvl>
     <w:lvl w:ilvl="6">
       <w:start w:val="1"/>
-      <w:numFmt w:val="bullet"/>
-      <w:lvlText w:val="●"/>
+      <w:numFmt w:val="decimal"/>
+      <w:lvlText w:val="%7."/>
       <w:lvlJc w:val="left"/>
       <w:pPr>
         <w:ind w:left="5040" w:hanging="360"/>
@@ -30919,8 +30873,8 @@
     </w:lvl>
     <w:lvl w:ilvl="7">
       <w:start w:val="1"/>
-      <w:numFmt w:val="bullet"/>
-      <w:lvlText w:val="○"/>
+      <w:numFmt w:val="lowerLetter"/>
+      <w:lvlText w:val="%8."/>
       <w:lvlJc w:val="left"/>
       <w:pPr>
         <w:ind w:left="5760" w:hanging="360"/>
@@ -30931,8 +30885,8 @@
     </w:lvl>
     <w:lvl w:ilvl="8">
       <w:start w:val="1"/>
-      <w:numFmt w:val="bullet"/>
-      <w:lvlText w:val="■"/>
+      <w:numFmt w:val="lowerRoman"/>
+      <w:lvlText w:val="%9."/>
       <w:lvlJc w:val="left"/>
       <w:pPr>
         <w:ind w:left="6480" w:hanging="360"/>
@@ -30945,8 +30899,8 @@
   <w:abstractNum w:abstractNumId="14">
     <w:lvl w:ilvl="0">
       <w:start w:val="1"/>
-      <w:numFmt w:val="bullet"/>
-      <w:lvlText w:val="●"/>
+      <w:numFmt w:val="decimal"/>
+      <w:lvlText w:val="%1."/>
       <w:lvlJc w:val="left"/>
       <w:pPr>
         <w:ind w:left="720" w:hanging="360"/>
@@ -30957,8 +30911,8 @@
     </w:lvl>
     <w:lvl w:ilvl="1">
       <w:start w:val="1"/>
-      <w:numFmt w:val="bullet"/>
-      <w:lvlText w:val="○"/>
+      <w:numFmt w:val="lowerLetter"/>
+      <w:lvlText w:val="%2."/>
       <w:lvlJc w:val="left"/>
       <w:pPr>
         <w:ind w:left="1440" w:hanging="360"/>
@@ -30969,8 +30923,8 @@
     </w:lvl>
     <w:lvl w:ilvl="2">
       <w:start w:val="1"/>
-      <w:numFmt w:val="bullet"/>
-      <w:lvlText w:val="■"/>
+      <w:numFmt w:val="lowerRoman"/>
+      <w:lvlText w:val="%3."/>
       <w:lvlJc w:val="left"/>
       <w:pPr>
         <w:ind w:left="2160" w:hanging="360"/>
@@ -30981,8 +30935,8 @@
     </w:lvl>
     <w:lvl w:ilvl="3">
       <w:start w:val="1"/>
-      <w:numFmt w:val="bullet"/>
-      <w:lvlText w:val="●"/>
+      <w:numFmt w:val="decimal"/>
+      <w:lvlText w:val="%4."/>
       <w:lvlJc w:val="left"/>
       <w:pPr>
         <w:ind w:left="2880" w:hanging="360"/>
@@ -30993,8 +30947,8 @@
     </w:lvl>
     <w:lvl w:ilvl="4">
       <w:start w:val="1"/>
-      <w:numFmt w:val="bullet"/>
-      <w:lvlText w:val="○"/>
+      <w:numFmt w:val="lowerLetter"/>
+      <w:lvlText w:val="%5."/>
       <w:lvlJc w:val="left"/>
       <w:pPr>
         <w:ind w:left="3600" w:hanging="360"/>
@@ -31005,8 +30959,8 @@
     </w:lvl>
     <w:lvl w:ilvl="5">
       <w:start w:val="1"/>
-      <w:numFmt w:val="bullet"/>
-      <w:lvlText w:val="■"/>
+      <w:numFmt w:val="lowerRoman"/>
+      <w:lvlText w:val="%6."/>
       <w:lvlJc w:val="left"/>
       <w:pPr>
         <w:ind w:left="4320" w:hanging="360"/>
@@ -31017,8 +30971,8 @@
     </w:lvl>
     <w:lvl w:ilvl="6">
       <w:start w:val="1"/>
-      <w:numFmt w:val="bullet"/>
-      <w:lvlText w:val="●"/>
+      <w:numFmt w:val="decimal"/>
+      <w:lvlText w:val="%7."/>
       <w:lvlJc w:val="left"/>
       <w:pPr>
         <w:ind w:left="5040" w:hanging="360"/>
@@ -31029,8 +30983,8 @@
     </w:lvl>
     <w:lvl w:ilvl="7">
       <w:start w:val="1"/>
-      <w:numFmt w:val="bullet"/>
-      <w:lvlText w:val="○"/>
+      <w:numFmt w:val="lowerLetter"/>
+      <w:lvlText w:val="%8."/>
       <w:lvlJc w:val="left"/>
       <w:pPr>
         <w:ind w:left="5760" w:hanging="360"/>
@@ -31041,8 +30995,8 @@
     </w:lvl>
     <w:lvl w:ilvl="8">
       <w:start w:val="1"/>
-      <w:numFmt w:val="bullet"/>
-      <w:lvlText w:val="■"/>
+      <w:numFmt w:val="lowerRoman"/>
+      <w:lvlText w:val="%9."/>
       <w:lvlJc w:val="left"/>
       <w:pPr>
         <w:ind w:left="6480" w:hanging="360"/>

</xml_diff>